<commit_message>
Complete API reference for custom frontend build
Adds the deployed server URL (http://35.254.19.129:8000) as the base
throughout, the previously-missing Feedback endpoints (record verdict,
history, recent, per-unit, label-progress stats), and a 'Building the
frontend' section mapping each screen to the exact endpoints that power
it, in build order. Regenerated the Word version.

Verified against the live OpenAPI spec: all 24 endpoints documented.
</commit_message>
<xml_diff>
--- a/docs/SenseMinds360-API-Reference.docx
+++ b/docs/SenseMinds360-API-Reference.docx
@@ -36,7 +36,7 @@
           <w:color w:val="57534E"/>
           <w:sz w:val="19"/>
         </w:rPr>
-        <w:t>For frontend developers · 18 July 2026</w:t>
+        <w:t>For the frontend engineer · Live server http://35.254.19.129:8000 · 22 July 2026</w:t>
       </w:r>
     </w:p>
     <w:p/>
@@ -46,14 +46,197 @@
           <w:b/>
           <w:sz w:val="21"/>
         </w:rPr>
-        <w:t>For frontend developers.</w:t>
+        <w:t>For the frontend engineer building a custom UI.</w:t>
       </w:r>
       <w:r>
         <w:rPr>
           <w:b w:val="0"/>
           <w:sz w:val="21"/>
         </w:rPr>
-        <w:t xml:space="preserve"> Every endpoint below is live; every example response was captured from the running system, not written by hand.</w:t>
+        <w:t xml:space="preserve"> Every endpoint below is live on the deployed server; every example response is a real shape from the running system, not hand-written.</w:t>
+      </w:r>
+    </w:p>
+    <w:p>
+      <w:pPr>
+        <w:pStyle w:val="Heading3"/>
+      </w:pPr>
+      <w:r>
+        <w:rPr>
+          <w:b/>
+          <w:color w:val="57534E"/>
+          <w:sz w:val="22"/>
+        </w:rPr>
+        <w:t>Live server</w:t>
+      </w:r>
+    </w:p>
+    <w:tbl>
+      <w:tblPr>
+        <w:tblW w:type="auto" w:w="0"/>
+        <w:tblLook w:firstColumn="1" w:firstRow="1" w:lastColumn="0" w:lastRow="0" w:noHBand="0" w:noVBand="1" w:val="04A0"/>
+      </w:tblPr>
+      <w:tblGrid>
+        <w:gridCol w:w="8640"/>
+      </w:tblGrid>
+      <w:tr>
+        <w:tc>
+          <w:tcPr>
+            <w:tcW w:type="dxa" w:w="8640"/>
+            <w:shd w:fill="F5F5F4"/>
+          </w:tcPr>
+          <w:p>
+            <w:pPr>
+              <w:spacing w:after="0" w:line="240" w:lineRule="auto"/>
+            </w:pPr>
+            <w:r/>
+            <w:r>
+              <w:rPr>
+                <w:rFonts w:ascii="Consolas" w:hAnsi="Consolas"/>
+                <w:color w:val="1C1917"/>
+                <w:sz w:val="17"/>
+              </w:rPr>
+              <w:t>Base URL:        http://35.254.19.129:8000</w:t>
+            </w:r>
+          </w:p>
+          <w:p>
+            <w:pPr>
+              <w:spacing w:after="0" w:line="240" w:lineRule="auto"/>
+            </w:pPr>
+            <w:r>
+              <w:rPr>
+                <w:rFonts w:ascii="Consolas" w:hAnsi="Consolas"/>
+                <w:color w:val="1C1917"/>
+                <w:sz w:val="17"/>
+              </w:rPr>
+              <w:t>API prefix:      http://35.254.19.129:8000/api/v1</w:t>
+            </w:r>
+          </w:p>
+          <w:p>
+            <w:pPr>
+              <w:spacing w:after="0" w:line="240" w:lineRule="auto"/>
+            </w:pPr>
+            <w:r>
+              <w:rPr>
+                <w:rFonts w:ascii="Consolas" w:hAnsi="Consolas"/>
+                <w:color w:val="1C1917"/>
+                <w:sz w:val="17"/>
+              </w:rPr>
+              <w:t>Interactive docs: http://35.254.19.129:8000/docs      (try every endpoint in the browser)</w:t>
+            </w:r>
+          </w:p>
+          <w:p>
+            <w:pPr>
+              <w:spacing w:after="0" w:line="240" w:lineRule="auto"/>
+            </w:pPr>
+            <w:r>
+              <w:rPr>
+                <w:rFonts w:ascii="Consolas" w:hAnsi="Consolas"/>
+                <w:color w:val="1C1917"/>
+                <w:sz w:val="17"/>
+              </w:rPr>
+              <w:t>Raw spec:         http://35.254.19.129:8000/openapi.json</w:t>
+            </w:r>
+          </w:p>
+        </w:tc>
+      </w:tr>
+    </w:tbl>
+    <w:p/>
+    <w:p>
+      <w:r>
+        <w:rPr>
+          <w:b w:val="0"/>
+          <w:sz w:val="21"/>
+        </w:rPr>
+        <w:t>Ops endpoints (</w:t>
+      </w:r>
+      <w:r>
+        <w:rPr>
+          <w:rFonts w:ascii="Consolas" w:hAnsi="Consolas"/>
+          <w:color w:val="BE123C"/>
+          <w:sz w:val="21"/>
+        </w:rPr>
+        <w:t>/health</w:t>
+      </w:r>
+      <w:r>
+        <w:rPr>
+          <w:b w:val="0"/>
+          <w:sz w:val="21"/>
+        </w:rPr>
+        <w:t xml:space="preserve">, </w:t>
+      </w:r>
+      <w:r>
+        <w:rPr>
+          <w:rFonts w:ascii="Consolas" w:hAnsi="Consolas"/>
+          <w:color w:val="BE123C"/>
+          <w:sz w:val="21"/>
+        </w:rPr>
+        <w:t>/ready</w:t>
+      </w:r>
+      <w:r>
+        <w:rPr>
+          <w:b w:val="0"/>
+          <w:sz w:val="21"/>
+        </w:rPr>
+        <w:t xml:space="preserve">, </w:t>
+      </w:r>
+      <w:r>
+        <w:rPr>
+          <w:rFonts w:ascii="Consolas" w:hAnsi="Consolas"/>
+          <w:color w:val="BE123C"/>
+          <w:sz w:val="21"/>
+        </w:rPr>
+        <w:t>/metrics</w:t>
+      </w:r>
+      <w:r>
+        <w:rPr>
+          <w:b w:val="0"/>
+          <w:sz w:val="21"/>
+        </w:rPr>
+        <w:t xml:space="preserve">) are at the root; everything else is under </w:t>
+      </w:r>
+      <w:r>
+        <w:rPr>
+          <w:rFonts w:ascii="Consolas" w:hAnsi="Consolas"/>
+          <w:color w:val="BE123C"/>
+          <w:sz w:val="21"/>
+        </w:rPr>
+        <w:t>/api/v1</w:t>
+      </w:r>
+      <w:r>
+        <w:rPr>
+          <w:b w:val="0"/>
+          <w:sz w:val="21"/>
+        </w:rPr>
+        <w:t xml:space="preserve">. Throughout this document </w:t>
+      </w:r>
+      <w:r>
+        <w:rPr>
+          <w:rFonts w:ascii="Consolas" w:hAnsi="Consolas"/>
+          <w:color w:val="BE123C"/>
+          <w:sz w:val="21"/>
+        </w:rPr>
+        <w:t>{BASE}</w:t>
+      </w:r>
+      <w:r>
+        <w:rPr>
+          <w:b w:val="0"/>
+          <w:sz w:val="21"/>
+        </w:rPr>
+        <w:t xml:space="preserve"> means </w:t>
+      </w:r>
+      <w:r>
+        <w:rPr>
+          <w:rFonts w:ascii="Consolas" w:hAnsi="Consolas"/>
+          <w:color w:val="BE123C"/>
+          <w:sz w:val="21"/>
+        </w:rPr>
+        <w:t>http://35.254.19.129:8000</w:t>
+      </w:r>
+      <w:r>
+        <w:rPr>
+          <w:b w:val="0"/>
+          <w:sz w:val="21"/>
+        </w:rPr>
+        <w:t>.</w:t>
       </w:r>
     </w:p>
     <w:p>
@@ -62,10 +245,17 @@
       </w:pPr>
       <w:r>
         <w:rPr>
+          <w:b/>
+          <w:sz w:val="21"/>
+        </w:rPr>
+        <w:t>Format:</w:t>
+      </w:r>
+      <w:r>
+        <w:rPr>
           <w:b w:val="0"/>
           <w:sz w:val="21"/>
         </w:rPr>
-        <w:t xml:space="preserve">Base URL: </w:t>
+        <w:t xml:space="preserve"> JSON in, JSON out. </w:t>
       </w:r>
       <w:r>
         <w:rPr>
@@ -73,14 +263,28 @@
           <w:color w:val="BE123C"/>
           <w:sz w:val="21"/>
         </w:rPr>
-        <w:t>{HOST}/api/v1</w:t>
+        <w:t>Content-Type: application/json</w:t>
       </w:r>
       <w:r>
         <w:rPr>
           <w:b w:val="0"/>
           <w:sz w:val="21"/>
         </w:rPr>
-        <w:t xml:space="preserve"> (ops endpoints are at the root, not under </w:t>
+        <w:t xml:space="preserve"> on every POST with a body — </w:t>
+      </w:r>
+      <w:r>
+        <w:rPr>
+          <w:b/>
+          <w:sz w:val="21"/>
+        </w:rPr>
+        <w:t>except</w:t>
+      </w:r>
+      <w:r>
+        <w:rPr>
+          <w:b w:val="0"/>
+          <w:sz w:val="21"/>
+        </w:rPr>
+        <w:t xml:space="preserve"> </w:t>
       </w:r>
       <w:r>
         <w:rPr>
@@ -88,14 +292,14 @@
           <w:color w:val="BE123C"/>
           <w:sz w:val="21"/>
         </w:rPr>
-        <w:t>/api/v1</w:t>
+        <w:t>/auth/token</w:t>
       </w:r>
       <w:r>
         <w:rPr>
           <w:b w:val="0"/>
           <w:sz w:val="21"/>
         </w:rPr>
-        <w:t>)</w:t>
+        <w:t>, which is form-encoded (OAuth2 standard).</w:t>
       </w:r>
     </w:p>
     <w:p>
@@ -104,10 +308,17 @@
       </w:pPr>
       <w:r>
         <w:rPr>
+          <w:b/>
+          <w:sz w:val="21"/>
+        </w:rPr>
+        <w:t>Auth:</w:t>
+      </w:r>
+      <w:r>
+        <w:rPr>
           <w:b w:val="0"/>
           <w:sz w:val="21"/>
         </w:rPr>
-        <w:t xml:space="preserve">Format: JSON in, JSON out. </w:t>
+        <w:t xml:space="preserve"> all </w:t>
       </w:r>
       <w:r>
         <w:rPr>
@@ -115,28 +326,14 @@
           <w:color w:val="BE123C"/>
           <w:sz w:val="21"/>
         </w:rPr>
-        <w:t>Content-Type: application/json</w:t>
+        <w:t>/api/v1</w:t>
       </w:r>
       <w:r>
         <w:rPr>
           <w:b w:val="0"/>
           <w:sz w:val="21"/>
         </w:rPr>
-        <w:t xml:space="preserve"> on every POST with a body — </w:t>
-      </w:r>
-      <w:r>
-        <w:rPr>
-          <w:b/>
-          <w:sz w:val="21"/>
-        </w:rPr>
-        <w:t>except</w:t>
-      </w:r>
-      <w:r>
-        <w:rPr>
-          <w:b w:val="0"/>
-          <w:sz w:val="21"/>
-        </w:rPr>
-        <w:t xml:space="preserve"> </w:t>
+        <w:t xml:space="preserve"> endpoints except </w:t>
       </w:r>
       <w:r>
         <w:rPr>
@@ -151,7 +348,7 @@
           <w:b w:val="0"/>
           <w:sz w:val="21"/>
         </w:rPr>
-        <w:t>, which is form-encoded (OAuth2 standard).</w:t>
+        <w:t xml:space="preserve"> require a Bearer token (§1).</w:t>
       </w:r>
     </w:p>
     <w:p>
@@ -160,40 +357,61 @@
       </w:pPr>
       <w:r>
         <w:rPr>
+          <w:b/>
+          <w:sz w:val="21"/>
+        </w:rPr>
+        <w:t>The `/docs` page is the fastest reference</w:t>
+      </w:r>
+      <w:r>
+        <w:rPr>
           <w:b w:val="0"/>
           <w:sz w:val="21"/>
         </w:rPr>
-        <w:t xml:space="preserve">Interactive spec: </w:t>
-      </w:r>
-      <w:r>
-        <w:rPr>
-          <w:b/>
-          <w:sz w:val="21"/>
-        </w:rPr>
-        <w:t>`{HOST}/docs`</w:t>
-      </w:r>
-      <w:r>
-        <w:rPr>
-          <w:b w:val="0"/>
-          <w:sz w:val="21"/>
-        </w:rPr>
-        <w:t xml:space="preserve"> (Swagger UI) and </w:t>
-      </w:r>
-      <w:r>
-        <w:rPr>
-          <w:b/>
-          <w:sz w:val="21"/>
-        </w:rPr>
-        <w:t>`{HOST}/openapi.json`</w:t>
-      </w:r>
-      <w:r>
-        <w:rPr>
-          <w:b w:val="0"/>
-          <w:sz w:val="21"/>
-        </w:rPr>
-        <w:t>. These are generated from the code, so they are never out of date.</w:t>
+        <w:t xml:space="preserve"> — it is generated from the code, is never out of date, and lets you call any endpoint live (click Authorize, paste a token, "Try it out").</w:t>
       </w:r>
     </w:p>
+    <w:tbl>
+      <w:tblPr>
+        <w:tblW w:type="auto" w:w="0"/>
+        <w:tblLook w:firstColumn="1" w:firstRow="1" w:lastColumn="0" w:lastRow="0" w:noHBand="0" w:noVBand="1" w:val="04A0"/>
+      </w:tblPr>
+      <w:tblGrid>
+        <w:gridCol w:w="8640"/>
+      </w:tblGrid>
+      <w:tr>
+        <w:tc>
+          <w:tcPr>
+            <w:tcW w:type="dxa" w:w="8640"/>
+            <w:shd w:fill="FEF3C7"/>
+          </w:tcPr>
+          <w:p>
+            <w:r/>
+            <w:r>
+              <w:rPr>
+                <w:b w:val="0"/>
+                <w:sz w:val="20"/>
+              </w:rPr>
+              <w:t xml:space="preserve">If you are building the UI, jump to </w:t>
+            </w:r>
+            <w:r>
+              <w:rPr>
+                <w:b/>
+                <w:sz w:val="20"/>
+              </w:rPr>
+              <w:t>§12 — Building the frontend</w:t>
+            </w:r>
+            <w:r>
+              <w:rPr>
+                <w:b w:val="0"/>
+                <w:sz w:val="20"/>
+              </w:rPr>
+              <w:t>: it maps each screen to the exact endpoints that power it, in a sensible build order.</w:t>
+            </w:r>
+          </w:p>
+        </w:tc>
+      </w:tr>
+    </w:tbl>
+    <w:p/>
     <w:p/>
     <w:p>
       <w:pPr>
@@ -5697,7 +5915,1177 @@
           <w:color w:val="1C1917"/>
           <w:sz w:val="27"/>
         </w:rPr>
-        <w:t>8. Analysis and audit</w:t>
+        <w:t>8. Feedback — the learning loop</w:t>
+      </w:r>
+    </w:p>
+    <w:p>
+      <w:r>
+        <w:rPr>
+          <w:b w:val="0"/>
+          <w:sz w:val="21"/>
+        </w:rPr>
+        <w:t xml:space="preserve">Engineers judge the platform's machine-learning findings ("was this worth flagging?"). Each verdict is stored as a training label and folded into the knowledge graph. </w:t>
+      </w:r>
+      <w:r>
+        <w:rPr>
+          <w:b/>
+          <w:sz w:val="21"/>
+        </w:rPr>
+        <w:t>Only `learned`-origin findings accept a verdict</w:t>
+      </w:r>
+      <w:r>
+        <w:rPr>
+          <w:b w:val="0"/>
+          <w:sz w:val="21"/>
+        </w:rPr>
+        <w:t xml:space="preserve"> — a measured fact is not a prediction to confirm.</w:t>
+      </w:r>
+    </w:p>
+    <w:p>
+      <w:r>
+        <w:rPr>
+          <w:b w:val="0"/>
+          <w:sz w:val="21"/>
+        </w:rPr>
+        <w:t xml:space="preserve">Verdicts key on </w:t>
+      </w:r>
+      <w:r>
+        <w:rPr>
+          <w:b/>
+          <w:sz w:val="21"/>
+        </w:rPr>
+        <w:t>`identity_key`</w:t>
+      </w:r>
+      <w:r>
+        <w:rPr>
+          <w:b w:val="0"/>
+          <w:sz w:val="21"/>
+        </w:rPr>
+        <w:t xml:space="preserve"> (the stable condition id), not </w:t>
+      </w:r>
+      <w:r>
+        <w:rPr>
+          <w:rFonts w:ascii="Consolas" w:hAnsi="Consolas"/>
+          <w:color w:val="BE123C"/>
+          <w:sz w:val="21"/>
+        </w:rPr>
+        <w:t>finding_id</w:t>
+      </w:r>
+      <w:r>
+        <w:rPr>
+          <w:b w:val="0"/>
+          <w:sz w:val="21"/>
+        </w:rPr>
+        <w:t>, so a label survives later observations of the same condition.</w:t>
+      </w:r>
+    </w:p>
+    <w:p>
+      <w:r>
+        <w:rPr>
+          <w:b w:val="0"/>
+          <w:sz w:val="21"/>
+        </w:rPr>
+        <w:t>Three verdict values:</w:t>
+      </w:r>
+    </w:p>
+    <w:tbl>
+      <w:tblPr>
+        <w:tblStyle w:val="TableGrid"/>
+        <w:tblW w:type="auto" w:w="0"/>
+        <w:jc w:val="center"/>
+        <w:tblLook w:firstColumn="1" w:firstRow="1" w:lastColumn="0" w:lastRow="0" w:noHBand="0" w:noVBand="1" w:val="04A0"/>
+      </w:tblPr>
+      <w:tblGrid>
+        <w:gridCol w:w="4320"/>
+        <w:gridCol w:w="4320"/>
+      </w:tblGrid>
+      <w:tr>
+        <w:tc>
+          <w:tcPr>
+            <w:tcW w:type="dxa" w:w="4824"/>
+            <w:shd w:fill="EDE9FE"/>
+          </w:tcPr>
+          <w:p>
+            <w:r>
+              <w:rPr>
+                <w:b/>
+              </w:rPr>
+            </w:r>
+            <w:r>
+              <w:rPr>
+                <w:b/>
+                <w:sz w:val="18"/>
+              </w:rPr>
+              <w:t>Value</w:t>
+            </w:r>
+          </w:p>
+        </w:tc>
+        <w:tc>
+          <w:tcPr>
+            <w:tcW w:type="dxa" w:w="4824"/>
+            <w:shd w:fill="EDE9FE"/>
+          </w:tcPr>
+          <w:p>
+            <w:r>
+              <w:rPr>
+                <w:b/>
+              </w:rPr>
+            </w:r>
+            <w:r>
+              <w:rPr>
+                <w:b/>
+                <w:sz w:val="18"/>
+              </w:rPr>
+              <w:t>Meaning (what to show the user)</w:t>
+            </w:r>
+          </w:p>
+        </w:tc>
+      </w:tr>
+      <w:tr>
+        <w:tc>
+          <w:tcPr>
+            <w:tcW w:type="dxa" w:w="4824"/>
+          </w:tcPr>
+          <w:p>
+            <w:r/>
+            <w:r>
+              <w:rPr>
+                <w:rFonts w:ascii="Consolas" w:hAnsi="Consolas"/>
+                <w:color w:val="BE123C"/>
+                <w:sz w:val="18"/>
+              </w:rPr>
+              <w:t>confirmed_novelty</w:t>
+            </w:r>
+          </w:p>
+        </w:tc>
+        <w:tc>
+          <w:tcPr>
+            <w:tcW w:type="dxa" w:w="4824"/>
+          </w:tcPr>
+          <w:p>
+            <w:r/>
+            <w:r>
+              <w:rPr>
+                <w:b w:val="0"/>
+                <w:sz w:val="18"/>
+              </w:rPr>
+              <w:t>"Real — something genuinely unusual"</w:t>
+            </w:r>
+          </w:p>
+        </w:tc>
+      </w:tr>
+      <w:tr>
+        <w:tc>
+          <w:tcPr>
+            <w:tcW w:type="dxa" w:w="4824"/>
+          </w:tcPr>
+          <w:p>
+            <w:r/>
+            <w:r>
+              <w:rPr>
+                <w:rFonts w:ascii="Consolas" w:hAnsi="Consolas"/>
+                <w:color w:val="BE123C"/>
+                <w:sz w:val="18"/>
+              </w:rPr>
+              <w:t>expected_behaviour</w:t>
+            </w:r>
+          </w:p>
+        </w:tc>
+        <w:tc>
+          <w:tcPr>
+            <w:tcW w:type="dxa" w:w="4824"/>
+          </w:tcPr>
+          <w:p>
+            <w:r/>
+            <w:r>
+              <w:rPr>
+                <w:b w:val="0"/>
+                <w:sz w:val="18"/>
+              </w:rPr>
+              <w:t>"Expected — normal for this machine"</w:t>
+            </w:r>
+          </w:p>
+        </w:tc>
+      </w:tr>
+      <w:tr>
+        <w:tc>
+          <w:tcPr>
+            <w:tcW w:type="dxa" w:w="4824"/>
+          </w:tcPr>
+          <w:p>
+            <w:r/>
+            <w:r>
+              <w:rPr>
+                <w:rFonts w:ascii="Consolas" w:hAnsi="Consolas"/>
+                <w:color w:val="BE123C"/>
+                <w:sz w:val="18"/>
+              </w:rPr>
+              <w:t>false_positive</w:t>
+            </w:r>
+          </w:p>
+        </w:tc>
+        <w:tc>
+          <w:tcPr>
+            <w:tcW w:type="dxa" w:w="4824"/>
+          </w:tcPr>
+          <w:p>
+            <w:r/>
+            <w:r>
+              <w:rPr>
+                <w:b w:val="0"/>
+                <w:sz w:val="18"/>
+              </w:rPr>
+              <w:t>"Wrong — nothing was happening"</w:t>
+            </w:r>
+          </w:p>
+        </w:tc>
+      </w:tr>
+    </w:tbl>
+    <w:p/>
+    <w:p>
+      <w:pPr>
+        <w:pStyle w:val="Heading3"/>
+      </w:pPr>
+      <w:r>
+        <w:rPr>
+          <w:rFonts w:ascii="Consolas" w:hAnsi="Consolas"/>
+          <w:b/>
+          <w:color w:val="57534E"/>
+          <w:sz w:val="22"/>
+        </w:rPr>
+        <w:t>POST /api/v1/findings/{identity_key}/feedback</w:t>
+      </w:r>
+      <w:r>
+        <w:rPr>
+          <w:b/>
+          <w:color w:val="57534E"/>
+          <w:sz w:val="22"/>
+        </w:rPr>
+        <w:t xml:space="preserve"> — record a verdict</w:t>
+      </w:r>
+    </w:p>
+    <w:p>
+      <w:r>
+        <w:rPr>
+          <w:b w:val="0"/>
+          <w:sz w:val="21"/>
+        </w:rPr>
+        <w:t>Body:</w:t>
+      </w:r>
+    </w:p>
+    <w:tbl>
+      <w:tblPr>
+        <w:tblW w:type="auto" w:w="0"/>
+        <w:tblLook w:firstColumn="1" w:firstRow="1" w:lastColumn="0" w:lastRow="0" w:noHBand="0" w:noVBand="1" w:val="04A0"/>
+      </w:tblPr>
+      <w:tblGrid>
+        <w:gridCol w:w="8640"/>
+      </w:tblGrid>
+      <w:tr>
+        <w:tc>
+          <w:tcPr>
+            <w:tcW w:type="dxa" w:w="8640"/>
+            <w:shd w:fill="F5F5F4"/>
+          </w:tcPr>
+          <w:p>
+            <w:pPr>
+              <w:spacing w:after="0" w:line="240" w:lineRule="auto"/>
+            </w:pPr>
+            <w:r/>
+            <w:r>
+              <w:rPr>
+                <w:rFonts w:ascii="Consolas" w:hAnsi="Consolas"/>
+                <w:color w:val="1C1917"/>
+                <w:sz w:val="17"/>
+              </w:rPr>
+              <w:t>{ "verdict": "confirmed_novelty", "note": "checked on site, bearing noise" }</w:t>
+            </w:r>
+          </w:p>
+        </w:tc>
+      </w:tr>
+    </w:tbl>
+    <w:p/>
+    <w:p>
+      <w:r>
+        <w:rPr>
+          <w:rFonts w:ascii="Consolas" w:hAnsi="Consolas"/>
+          <w:color w:val="BE123C"/>
+          <w:sz w:val="21"/>
+        </w:rPr>
+        <w:t>note</w:t>
+      </w:r>
+      <w:r>
+        <w:rPr>
+          <w:b w:val="0"/>
+          <w:sz w:val="21"/>
+        </w:rPr>
+        <w:t xml:space="preserve"> is optional (≤ 2000 chars). The </w:t>
+      </w:r>
+      <w:r>
+        <w:rPr>
+          <w:b/>
+          <w:sz w:val="21"/>
+        </w:rPr>
+        <w:t>author is taken from the token</w:t>
+      </w:r>
+      <w:r>
+        <w:rPr>
+          <w:b w:val="0"/>
+          <w:sz w:val="21"/>
+        </w:rPr>
+        <w:t xml:space="preserve">, never the body. Returns </w:t>
+      </w:r>
+      <w:r>
+        <w:rPr>
+          <w:rFonts w:ascii="Consolas" w:hAnsi="Consolas"/>
+          <w:color w:val="BE123C"/>
+          <w:sz w:val="21"/>
+        </w:rPr>
+        <w:t>201</w:t>
+      </w:r>
+      <w:r>
+        <w:rPr>
+          <w:b w:val="0"/>
+          <w:sz w:val="21"/>
+        </w:rPr>
+        <w:t>:</w:t>
+      </w:r>
+    </w:p>
+    <w:tbl>
+      <w:tblPr>
+        <w:tblW w:type="auto" w:w="0"/>
+        <w:tblLook w:firstColumn="1" w:firstRow="1" w:lastColumn="0" w:lastRow="0" w:noHBand="0" w:noVBand="1" w:val="04A0"/>
+      </w:tblPr>
+      <w:tblGrid>
+        <w:gridCol w:w="8640"/>
+      </w:tblGrid>
+      <w:tr>
+        <w:tc>
+          <w:tcPr>
+            <w:tcW w:type="dxa" w:w="8640"/>
+            <w:shd w:fill="F5F5F4"/>
+          </w:tcPr>
+          <w:p>
+            <w:pPr>
+              <w:spacing w:after="0" w:line="240" w:lineRule="auto"/>
+            </w:pPr>
+            <w:r/>
+            <w:r>
+              <w:rPr>
+                <w:rFonts w:ascii="Consolas" w:hAnsi="Consolas"/>
+                <w:color w:val="1C1917"/>
+                <w:sz w:val="17"/>
+              </w:rPr>
+              <w:t>{</w:t>
+            </w:r>
+          </w:p>
+          <w:p>
+            <w:pPr>
+              <w:spacing w:after="0" w:line="240" w:lineRule="auto"/>
+            </w:pPr>
+            <w:r>
+              <w:rPr>
+                <w:rFonts w:ascii="Consolas" w:hAnsi="Consolas"/>
+                <w:color w:val="1C1917"/>
+                <w:sz w:val="17"/>
+              </w:rPr>
+              <w:t xml:space="preserve">  "feedback_id": "0f3a…",</w:t>
+            </w:r>
+          </w:p>
+          <w:p>
+            <w:pPr>
+              <w:spacing w:after="0" w:line="240" w:lineRule="auto"/>
+            </w:pPr>
+            <w:r>
+              <w:rPr>
+                <w:rFonts w:ascii="Consolas" w:hAnsi="Consolas"/>
+                <w:color w:val="1C1917"/>
+                <w:sz w:val="17"/>
+              </w:rPr>
+              <w:t xml:space="preserve">  "identity_key": "570ffdfb43fc8eee",</w:t>
+            </w:r>
+          </w:p>
+          <w:p>
+            <w:pPr>
+              <w:spacing w:after="0" w:line="240" w:lineRule="auto"/>
+            </w:pPr>
+            <w:r>
+              <w:rPr>
+                <w:rFonts w:ascii="Consolas" w:hAnsi="Consolas"/>
+                <w:color w:val="1C1917"/>
+                <w:sz w:val="17"/>
+              </w:rPr>
+              <w:t xml:space="preserve">  "finding_id": "4efff651b2e1b571",</w:t>
+            </w:r>
+          </w:p>
+          <w:p>
+            <w:pPr>
+              <w:spacing w:after="0" w:line="240" w:lineRule="auto"/>
+            </w:pPr>
+            <w:r>
+              <w:rPr>
+                <w:rFonts w:ascii="Consolas" w:hAnsi="Consolas"/>
+                <w:color w:val="1C1917"/>
+                <w:sz w:val="17"/>
+              </w:rPr>
+              <w:t xml:space="preserve">  "unit": "SC-126",</w:t>
+            </w:r>
+          </w:p>
+          <w:p>
+            <w:pPr>
+              <w:spacing w:after="0" w:line="240" w:lineRule="auto"/>
+            </w:pPr>
+            <w:r>
+              <w:rPr>
+                <w:rFonts w:ascii="Consolas" w:hAnsi="Consolas"/>
+                <w:color w:val="1C1917"/>
+                <w:sz w:val="17"/>
+              </w:rPr>
+              <w:t xml:space="preserve">  "verdict": "confirmed_novelty",</w:t>
+            </w:r>
+          </w:p>
+          <w:p>
+            <w:pPr>
+              <w:spacing w:after="0" w:line="240" w:lineRule="auto"/>
+            </w:pPr>
+            <w:r>
+              <w:rPr>
+                <w:rFonts w:ascii="Consolas" w:hAnsi="Consolas"/>
+                <w:color w:val="1C1917"/>
+                <w:sz w:val="17"/>
+              </w:rPr>
+              <w:t xml:space="preserve">  "author": "admin",</w:t>
+            </w:r>
+          </w:p>
+          <w:p>
+            <w:pPr>
+              <w:spacing w:after="0" w:line="240" w:lineRule="auto"/>
+            </w:pPr>
+            <w:r>
+              <w:rPr>
+                <w:rFonts w:ascii="Consolas" w:hAnsi="Consolas"/>
+                <w:color w:val="1C1917"/>
+                <w:sz w:val="17"/>
+              </w:rPr>
+              <w:t xml:space="preserve">  "note": "checked on site, bearing noise",</w:t>
+            </w:r>
+          </w:p>
+          <w:p>
+            <w:pPr>
+              <w:spacing w:after="0" w:line="240" w:lineRule="auto"/>
+            </w:pPr>
+            <w:r>
+              <w:rPr>
+                <w:rFonts w:ascii="Consolas" w:hAnsi="Consolas"/>
+                <w:color w:val="1C1917"/>
+                <w:sz w:val="17"/>
+              </w:rPr>
+              <w:t xml:space="preserve">  "created_at": "2026-07-22T09:12:44+00:00"</w:t>
+            </w:r>
+          </w:p>
+          <w:p>
+            <w:pPr>
+              <w:spacing w:after="0" w:line="240" w:lineRule="auto"/>
+            </w:pPr>
+            <w:r>
+              <w:rPr>
+                <w:rFonts w:ascii="Consolas" w:hAnsi="Consolas"/>
+                <w:color w:val="1C1917"/>
+                <w:sz w:val="17"/>
+              </w:rPr>
+              <w:t>}</w:t>
+            </w:r>
+          </w:p>
+        </w:tc>
+      </w:tr>
+    </w:tbl>
+    <w:p/>
+    <w:p>
+      <w:r>
+        <w:rPr>
+          <w:b w:val="0"/>
+          <w:sz w:val="21"/>
+        </w:rPr>
+        <w:t>Errors the UI must handle:</w:t>
+      </w:r>
+    </w:p>
+    <w:tbl>
+      <w:tblPr>
+        <w:tblStyle w:val="TableGrid"/>
+        <w:tblW w:type="auto" w:w="0"/>
+        <w:jc w:val="center"/>
+        <w:tblLook w:firstColumn="1" w:firstRow="1" w:lastColumn="0" w:lastRow="0" w:noHBand="0" w:noVBand="1" w:val="04A0"/>
+      </w:tblPr>
+      <w:tblGrid>
+        <w:gridCol w:w="2880"/>
+        <w:gridCol w:w="2880"/>
+        <w:gridCol w:w="2880"/>
+      </w:tblGrid>
+      <w:tr>
+        <w:tc>
+          <w:tcPr>
+            <w:tcW w:type="dxa" w:w="3216"/>
+            <w:shd w:fill="EDE9FE"/>
+          </w:tcPr>
+          <w:p>
+            <w:r>
+              <w:rPr>
+                <w:b/>
+              </w:rPr>
+            </w:r>
+            <w:r>
+              <w:rPr>
+                <w:b/>
+                <w:sz w:val="18"/>
+              </w:rPr>
+              <w:t>Status</w:t>
+            </w:r>
+          </w:p>
+        </w:tc>
+        <w:tc>
+          <w:tcPr>
+            <w:tcW w:type="dxa" w:w="3216"/>
+            <w:shd w:fill="EDE9FE"/>
+          </w:tcPr>
+          <w:p>
+            <w:r>
+              <w:rPr>
+                <w:b/>
+              </w:rPr>
+            </w:r>
+            <w:r>
+              <w:rPr>
+                <w:b/>
+                <w:sz w:val="18"/>
+              </w:rPr>
+              <w:t>When</w:t>
+            </w:r>
+          </w:p>
+        </w:tc>
+        <w:tc>
+          <w:tcPr>
+            <w:tcW w:type="dxa" w:w="3216"/>
+            <w:shd w:fill="EDE9FE"/>
+          </w:tcPr>
+          <w:p>
+            <w:r>
+              <w:rPr>
+                <w:b/>
+              </w:rPr>
+            </w:r>
+            <w:r>
+              <w:rPr>
+                <w:b/>
+                <w:sz w:val="18"/>
+              </w:rPr>
+              <w:t>Show</w:t>
+            </w:r>
+          </w:p>
+        </w:tc>
+      </w:tr>
+      <w:tr>
+        <w:tc>
+          <w:tcPr>
+            <w:tcW w:type="dxa" w:w="3216"/>
+          </w:tcPr>
+          <w:p>
+            <w:r/>
+            <w:r>
+              <w:rPr>
+                <w:rFonts w:ascii="Consolas" w:hAnsi="Consolas"/>
+                <w:color w:val="BE123C"/>
+                <w:sz w:val="18"/>
+              </w:rPr>
+              <w:t>400</w:t>
+            </w:r>
+          </w:p>
+        </w:tc>
+        <w:tc>
+          <w:tcPr>
+            <w:tcW w:type="dxa" w:w="3216"/>
+          </w:tcPr>
+          <w:p>
+            <w:r/>
+            <w:r>
+              <w:rPr>
+                <w:b w:val="0"/>
+                <w:sz w:val="18"/>
+              </w:rPr>
+              <w:t xml:space="preserve">finding is </w:t>
+            </w:r>
+            <w:r>
+              <w:rPr>
+                <w:rFonts w:ascii="Consolas" w:hAnsi="Consolas"/>
+                <w:color w:val="BE123C"/>
+                <w:sz w:val="18"/>
+              </w:rPr>
+              <w:t>derived</w:t>
+            </w:r>
+            <w:r>
+              <w:rPr>
+                <w:b w:val="0"/>
+                <w:sz w:val="18"/>
+              </w:rPr>
+              <w:t>/</w:t>
+            </w:r>
+            <w:r>
+              <w:rPr>
+                <w:rFonts w:ascii="Consolas" w:hAnsi="Consolas"/>
+                <w:color w:val="BE123C"/>
+                <w:sz w:val="18"/>
+              </w:rPr>
+              <w:t>diagnosed</w:t>
+            </w:r>
+            <w:r>
+              <w:rPr>
+                <w:b w:val="0"/>
+                <w:sz w:val="18"/>
+              </w:rPr>
+              <w:t xml:space="preserve">, not </w:t>
+            </w:r>
+            <w:r>
+              <w:rPr>
+                <w:rFonts w:ascii="Consolas" w:hAnsi="Consolas"/>
+                <w:color w:val="BE123C"/>
+                <w:sz w:val="18"/>
+              </w:rPr>
+              <w:t>learned</w:t>
+            </w:r>
+          </w:p>
+        </w:tc>
+        <w:tc>
+          <w:tcPr>
+            <w:tcW w:type="dxa" w:w="3216"/>
+          </w:tcPr>
+          <w:p>
+            <w:r/>
+            <w:r>
+              <w:rPr>
+                <w:b w:val="0"/>
+                <w:sz w:val="18"/>
+              </w:rPr>
+              <w:t>"Only early-signal findings can be rated" — hide the buttons for non-learned findings</w:t>
+            </w:r>
+          </w:p>
+        </w:tc>
+      </w:tr>
+      <w:tr>
+        <w:tc>
+          <w:tcPr>
+            <w:tcW w:type="dxa" w:w="3216"/>
+          </w:tcPr>
+          <w:p>
+            <w:r/>
+            <w:r>
+              <w:rPr>
+                <w:rFonts w:ascii="Consolas" w:hAnsi="Consolas"/>
+                <w:color w:val="BE123C"/>
+                <w:sz w:val="18"/>
+              </w:rPr>
+              <w:t>404</w:t>
+            </w:r>
+          </w:p>
+        </w:tc>
+        <w:tc>
+          <w:tcPr>
+            <w:tcW w:type="dxa" w:w="3216"/>
+          </w:tcPr>
+          <w:p>
+            <w:r/>
+            <w:r>
+              <w:rPr>
+                <w:b w:val="0"/>
+                <w:sz w:val="18"/>
+              </w:rPr>
+              <w:t xml:space="preserve">unknown </w:t>
+            </w:r>
+            <w:r>
+              <w:rPr>
+                <w:rFonts w:ascii="Consolas" w:hAnsi="Consolas"/>
+                <w:color w:val="BE123C"/>
+                <w:sz w:val="18"/>
+              </w:rPr>
+              <w:t>identity_key</w:t>
+            </w:r>
+          </w:p>
+        </w:tc>
+        <w:tc>
+          <w:tcPr>
+            <w:tcW w:type="dxa" w:w="3216"/>
+          </w:tcPr>
+          <w:p>
+            <w:r/>
+            <w:r>
+              <w:rPr>
+                <w:b w:val="0"/>
+                <w:sz w:val="18"/>
+              </w:rPr>
+              <w:t>—</w:t>
+            </w:r>
+          </w:p>
+        </w:tc>
+      </w:tr>
+      <w:tr>
+        <w:tc>
+          <w:tcPr>
+            <w:tcW w:type="dxa" w:w="3216"/>
+          </w:tcPr>
+          <w:p>
+            <w:r/>
+            <w:r>
+              <w:rPr>
+                <w:rFonts w:ascii="Consolas" w:hAnsi="Consolas"/>
+                <w:color w:val="BE123C"/>
+                <w:sz w:val="18"/>
+              </w:rPr>
+              <w:t>422</w:t>
+            </w:r>
+          </w:p>
+        </w:tc>
+        <w:tc>
+          <w:tcPr>
+            <w:tcW w:type="dxa" w:w="3216"/>
+          </w:tcPr>
+          <w:p>
+            <w:r/>
+            <w:r>
+              <w:rPr>
+                <w:b w:val="0"/>
+                <w:sz w:val="18"/>
+              </w:rPr>
+              <w:t>invalid verdict value or note too long</w:t>
+            </w:r>
+          </w:p>
+        </w:tc>
+        <w:tc>
+          <w:tcPr>
+            <w:tcW w:type="dxa" w:w="3216"/>
+          </w:tcPr>
+          <w:p>
+            <w:r/>
+            <w:r>
+              <w:rPr>
+                <w:b w:val="0"/>
+                <w:sz w:val="18"/>
+              </w:rPr>
+              <w:t>fix input</w:t>
+            </w:r>
+          </w:p>
+        </w:tc>
+      </w:tr>
+    </w:tbl>
+    <w:p/>
+    <w:p>
+      <w:r>
+        <w:rPr>
+          <w:b w:val="0"/>
+          <w:sz w:val="21"/>
+        </w:rPr>
+        <w:t xml:space="preserve">Re-sending the </w:t>
+      </w:r>
+      <w:r>
+        <w:rPr>
+          <w:b/>
+          <w:sz w:val="21"/>
+        </w:rPr>
+        <w:t>same</w:t>
+      </w:r>
+      <w:r>
+        <w:rPr>
+          <w:b w:val="0"/>
+          <w:sz w:val="21"/>
+        </w:rPr>
+        <w:t xml:space="preserve"> verdict is a no-op (idempotent); a </w:t>
+      </w:r>
+      <w:r>
+        <w:rPr>
+          <w:b/>
+          <w:sz w:val="21"/>
+        </w:rPr>
+        <w:t>changed</w:t>
+      </w:r>
+      <w:r>
+        <w:rPr>
+          <w:b w:val="0"/>
+          <w:sz w:val="21"/>
+        </w:rPr>
+        <w:t xml:space="preserve"> verdict appends a new row (full history kept).</w:t>
+      </w:r>
+    </w:p>
+    <w:p>
+      <w:pPr>
+        <w:pStyle w:val="Heading3"/>
+      </w:pPr>
+      <w:r>
+        <w:rPr>
+          <w:rFonts w:ascii="Consolas" w:hAnsi="Consolas"/>
+          <w:b/>
+          <w:color w:val="57534E"/>
+          <w:sz w:val="22"/>
+        </w:rPr>
+        <w:t>GET /api/v1/findings/{identity_key}/feedback</w:t>
+      </w:r>
+      <w:r>
+        <w:rPr>
+          <w:b/>
+          <w:color w:val="57534E"/>
+          <w:sz w:val="22"/>
+        </w:rPr>
+        <w:t xml:space="preserve"> — verdict history</w:t>
+      </w:r>
+    </w:p>
+    <w:p>
+      <w:r>
+        <w:rPr>
+          <w:b w:val="0"/>
+          <w:sz w:val="21"/>
+        </w:rPr>
+        <w:t xml:space="preserve">Array of the above shape, oldest first — includes disagreements between engineers. Use the </w:t>
+      </w:r>
+      <w:r>
+        <w:rPr>
+          <w:b/>
+          <w:sz w:val="21"/>
+        </w:rPr>
+        <w:t>last</w:t>
+      </w:r>
+      <w:r>
+        <w:rPr>
+          <w:b w:val="0"/>
+          <w:sz w:val="21"/>
+        </w:rPr>
+        <w:t xml:space="preserve"> entry as the current verdict.</w:t>
+      </w:r>
+    </w:p>
+    <w:p>
+      <w:pPr>
+        <w:pStyle w:val="Heading3"/>
+      </w:pPr>
+      <w:r>
+        <w:rPr>
+          <w:rFonts w:ascii="Consolas" w:hAnsi="Consolas"/>
+          <w:b/>
+          <w:color w:val="57534E"/>
+          <w:sz w:val="22"/>
+        </w:rPr>
+        <w:t>GET /api/v1/feedback?limit=100</w:t>
+      </w:r>
+      <w:r>
+        <w:rPr>
+          <w:b/>
+          <w:color w:val="57534E"/>
+          <w:sz w:val="22"/>
+        </w:rPr>
+        <w:t xml:space="preserve"> — recent verdicts (all machines)</w:t>
+      </w:r>
+    </w:p>
+    <w:p>
+      <w:pPr>
+        <w:pStyle w:val="Heading3"/>
+      </w:pPr>
+      <w:r>
+        <w:rPr>
+          <w:rFonts w:ascii="Consolas" w:hAnsi="Consolas"/>
+          <w:b/>
+          <w:color w:val="57534E"/>
+          <w:sz w:val="22"/>
+        </w:rPr>
+        <w:t>GET /api/v1/assets/{unit}/feedback?limit=100</w:t>
+      </w:r>
+      <w:r>
+        <w:rPr>
+          <w:b/>
+          <w:color w:val="57534E"/>
+          <w:sz w:val="22"/>
+        </w:rPr>
+        <w:t xml:space="preserve"> — recent verdicts (one machine)</w:t>
+      </w:r>
+    </w:p>
+    <w:p>
+      <w:r>
+        <w:rPr>
+          <w:rFonts w:ascii="Consolas" w:hAnsi="Consolas"/>
+          <w:color w:val="BE123C"/>
+          <w:sz w:val="21"/>
+        </w:rPr>
+        <w:t>limit</w:t>
+      </w:r>
+      <w:r>
+        <w:rPr>
+          <w:b w:val="0"/>
+          <w:sz w:val="21"/>
+        </w:rPr>
+        <w:t xml:space="preserve"> 1–500, default 100, newest first. Same object shape.</w:t>
+      </w:r>
+    </w:p>
+    <w:p>
+      <w:pPr>
+        <w:pStyle w:val="Heading3"/>
+      </w:pPr>
+      <w:r>
+        <w:rPr>
+          <w:rFonts w:ascii="Consolas" w:hAnsi="Consolas"/>
+          <w:b/>
+          <w:color w:val="57534E"/>
+          <w:sz w:val="22"/>
+        </w:rPr>
+        <w:t>GET /api/v1/feedback/stats</w:t>
+      </w:r>
+      <w:r>
+        <w:rPr>
+          <w:b/>
+          <w:color w:val="57534E"/>
+          <w:sz w:val="22"/>
+        </w:rPr>
+        <w:t xml:space="preserve"> — label-readiness progress</w:t>
+      </w:r>
+    </w:p>
+    <w:p>
+      <w:r>
+        <w:rPr>
+          <w:b w:val="0"/>
+          <w:sz w:val="21"/>
+        </w:rPr>
+        <w:t>For a "how close are we to training the next model" widget:</w:t>
+      </w:r>
+    </w:p>
+    <w:tbl>
+      <w:tblPr>
+        <w:tblW w:type="auto" w:w="0"/>
+        <w:tblLook w:firstColumn="1" w:firstRow="1" w:lastColumn="0" w:lastRow="0" w:noHBand="0" w:noVBand="1" w:val="04A0"/>
+      </w:tblPr>
+      <w:tblGrid>
+        <w:gridCol w:w="8640"/>
+      </w:tblGrid>
+      <w:tr>
+        <w:tc>
+          <w:tcPr>
+            <w:tcW w:type="dxa" w:w="8640"/>
+            <w:shd w:fill="F5F5F4"/>
+          </w:tcPr>
+          <w:p>
+            <w:pPr>
+              <w:spacing w:after="0" w:line="240" w:lineRule="auto"/>
+            </w:pPr>
+            <w:r/>
+            <w:r>
+              <w:rPr>
+                <w:rFonts w:ascii="Consolas" w:hAnsi="Consolas"/>
+                <w:color w:val="1C1917"/>
+                <w:sz w:val="17"/>
+              </w:rPr>
+              <w:t>{</w:t>
+            </w:r>
+          </w:p>
+          <w:p>
+            <w:pPr>
+              <w:spacing w:after="0" w:line="240" w:lineRule="auto"/>
+            </w:pPr>
+            <w:r>
+              <w:rPr>
+                <w:rFonts w:ascii="Consolas" w:hAnsi="Consolas"/>
+                <w:color w:val="1C1917"/>
+                <w:sz w:val="17"/>
+              </w:rPr>
+              <w:t xml:space="preserve">  "labelled_conditions": 2,</w:t>
+            </w:r>
+          </w:p>
+          <w:p>
+            <w:pPr>
+              <w:spacing w:after="0" w:line="240" w:lineRule="auto"/>
+            </w:pPr>
+            <w:r>
+              <w:rPr>
+                <w:rFonts w:ascii="Consolas" w:hAnsi="Consolas"/>
+                <w:color w:val="1C1917"/>
+                <w:sz w:val="17"/>
+              </w:rPr>
+              <w:t xml:space="preserve">  "total_verdicts": 3,</w:t>
+            </w:r>
+          </w:p>
+          <w:p>
+            <w:pPr>
+              <w:spacing w:after="0" w:line="240" w:lineRule="auto"/>
+            </w:pPr>
+            <w:r>
+              <w:rPr>
+                <w:rFonts w:ascii="Consolas" w:hAnsi="Consolas"/>
+                <w:color w:val="1C1917"/>
+                <w:sz w:val="17"/>
+              </w:rPr>
+              <w:t xml:space="preserve">  "contributors": 1,</w:t>
+            </w:r>
+          </w:p>
+          <w:p>
+            <w:pPr>
+              <w:spacing w:after="0" w:line="240" w:lineRule="auto"/>
+            </w:pPr>
+            <w:r>
+              <w:rPr>
+                <w:rFonts w:ascii="Consolas" w:hAnsi="Consolas"/>
+                <w:color w:val="1C1917"/>
+                <w:sz w:val="17"/>
+              </w:rPr>
+              <w:t xml:space="preserve">  "units_covered": 1,</w:t>
+            </w:r>
+          </w:p>
+          <w:p>
+            <w:pPr>
+              <w:spacing w:after="0" w:line="240" w:lineRule="auto"/>
+            </w:pPr>
+            <w:r>
+              <w:rPr>
+                <w:rFonts w:ascii="Consolas" w:hAnsi="Consolas"/>
+                <w:color w:val="1C1917"/>
+                <w:sz w:val="17"/>
+              </w:rPr>
+              <w:t xml:space="preserve">  "by_verdict": { "confirmed_novelty": 1, "false_positive": 1 },</w:t>
+            </w:r>
+          </w:p>
+          <w:p>
+            <w:pPr>
+              <w:spacing w:after="0" w:line="240" w:lineRule="auto"/>
+            </w:pPr>
+            <w:r>
+              <w:rPr>
+                <w:rFonts w:ascii="Consolas" w:hAnsi="Consolas"/>
+                <w:color w:val="1C1917"/>
+                <w:sz w:val="17"/>
+              </w:rPr>
+              <w:t xml:space="preserve">  "target": 200,</w:t>
+            </w:r>
+          </w:p>
+          <w:p>
+            <w:pPr>
+              <w:spacing w:after="0" w:line="240" w:lineRule="auto"/>
+            </w:pPr>
+            <w:r>
+              <w:rPr>
+                <w:rFonts w:ascii="Consolas" w:hAnsi="Consolas"/>
+                <w:color w:val="1C1917"/>
+                <w:sz w:val="17"/>
+              </w:rPr>
+              <w:t xml:space="preserve">  "percent_to_target": 1.0,</w:t>
+            </w:r>
+          </w:p>
+          <w:p>
+            <w:pPr>
+              <w:spacing w:after="0" w:line="240" w:lineRule="auto"/>
+            </w:pPr>
+            <w:r>
+              <w:rPr>
+                <w:rFonts w:ascii="Consolas" w:hAnsi="Consolas"/>
+                <w:color w:val="1C1917"/>
+                <w:sz w:val="17"/>
+              </w:rPr>
+              <w:t xml:space="preserve">  "phase_c_ready": false</w:t>
+            </w:r>
+          </w:p>
+          <w:p>
+            <w:pPr>
+              <w:spacing w:after="0" w:line="240" w:lineRule="auto"/>
+            </w:pPr>
+            <w:r>
+              <w:rPr>
+                <w:rFonts w:ascii="Consolas" w:hAnsi="Consolas"/>
+                <w:color w:val="1C1917"/>
+                <w:sz w:val="17"/>
+              </w:rPr>
+              <w:t>}</w:t>
+            </w:r>
+          </w:p>
+        </w:tc>
+      </w:tr>
+    </w:tbl>
+    <w:p/>
+    <w:p>
+      <w:r>
+        <w:rPr>
+          <w:rFonts w:ascii="Consolas" w:hAnsi="Consolas"/>
+          <w:color w:val="BE123C"/>
+          <w:sz w:val="21"/>
+        </w:rPr>
+        <w:t>labelled_conditions</w:t>
+      </w:r>
+      <w:r>
+        <w:rPr>
+          <w:b w:val="0"/>
+          <w:sz w:val="21"/>
+        </w:rPr>
+        <w:t xml:space="preserve"> counts </w:t>
+      </w:r>
+      <w:r>
+        <w:rPr>
+          <w:b/>
+          <w:sz w:val="21"/>
+        </w:rPr>
+        <w:t>distinct</w:t>
+      </w:r>
+      <w:r>
+        <w:rPr>
+          <w:b w:val="0"/>
+          <w:sz w:val="21"/>
+        </w:rPr>
+        <w:t xml:space="preserve"> conditions (re-labelling one doesn't inflate it). </w:t>
+      </w:r>
+      <w:r>
+        <w:rPr>
+          <w:rFonts w:ascii="Consolas" w:hAnsi="Consolas"/>
+          <w:color w:val="BE123C"/>
+          <w:sz w:val="21"/>
+        </w:rPr>
+        <w:t>phase_c_ready</w:t>
+      </w:r>
+      <w:r>
+        <w:rPr>
+          <w:b w:val="0"/>
+          <w:sz w:val="21"/>
+        </w:rPr>
+        <w:t xml:space="preserve"> is honestly </w:t>
+      </w:r>
+      <w:r>
+        <w:rPr>
+          <w:rFonts w:ascii="Consolas" w:hAnsi="Consolas"/>
+          <w:color w:val="BE123C"/>
+          <w:sz w:val="21"/>
+        </w:rPr>
+        <w:t>false</w:t>
+      </w:r>
+      <w:r>
+        <w:rPr>
+          <w:b w:val="0"/>
+          <w:sz w:val="21"/>
+        </w:rPr>
+        <w:t xml:space="preserve"> until </w:t>
+      </w:r>
+      <w:r>
+        <w:rPr>
+          <w:rFonts w:ascii="Consolas" w:hAnsi="Consolas"/>
+          <w:color w:val="BE123C"/>
+          <w:sz w:val="21"/>
+        </w:rPr>
+        <w:t>target</w:t>
+      </w:r>
+      <w:r>
+        <w:rPr>
+          <w:b w:val="0"/>
+          <w:sz w:val="21"/>
+        </w:rPr>
+        <w:t xml:space="preserve"> is reached.</w:t>
+      </w:r>
+    </w:p>
+    <w:p/>
+    <w:p>
+      <w:pPr>
+        <w:pStyle w:val="Heading2"/>
+      </w:pPr>
+      <w:r>
+        <w:rPr>
+          <w:b/>
+          <w:color w:val="1C1917"/>
+          <w:sz w:val="27"/>
+        </w:rPr>
+        <w:t>9. Analysis and audit</w:t>
       </w:r>
     </w:p>
     <w:p>
@@ -5907,7 +7295,7 @@
           <w:color w:val="1C1917"/>
           <w:sz w:val="27"/>
         </w:rPr>
-        <w:t>9. Knowledge graph</w:t>
+        <w:t>10. Knowledge graph</w:t>
       </w:r>
     </w:p>
     <w:p>
@@ -6009,7 +7397,7 @@
           <w:color w:val="1C1917"/>
           <w:sz w:val="27"/>
         </w:rPr>
-        <w:t>10. Ops endpoints (no auth, root path)</w:t>
+        <w:t>11. Ops endpoints (no auth, root path)</w:t>
       </w:r>
     </w:p>
     <w:tbl>
@@ -6268,7 +7656,7 @@
           <w:color w:val="1C1917"/>
           <w:sz w:val="27"/>
         </w:rPr>
-        <w:t>11. Frontend integration notes</w:t>
+        <w:t>12. Frontend integration notes</w:t>
       </w:r>
     </w:p>
     <w:p>
@@ -6907,6 +8295,1557 @@
           <w:sz w:val="21"/>
         </w:rPr>
         <w:t xml:space="preserve"> are advisory hypotheses. Never render them with the same weight as measured facts — the backend deliberately never alarms on them alone.</w:t>
+      </w:r>
+    </w:p>
+    <w:p/>
+    <w:p>
+      <w:pPr>
+        <w:pStyle w:val="Heading2"/>
+      </w:pPr>
+      <w:r>
+        <w:rPr>
+          <w:b/>
+          <w:color w:val="1C1917"/>
+          <w:sz w:val="27"/>
+        </w:rPr>
+        <w:t>13. Building the frontend — screen → endpoint map</w:t>
+      </w:r>
+    </w:p>
+    <w:p>
+      <w:r>
+        <w:rPr>
+          <w:b w:val="0"/>
+          <w:sz w:val="21"/>
+        </w:rPr>
+        <w:t>A suggested build order. Each screen lists exactly the calls that power it.</w:t>
+      </w:r>
+    </w:p>
+    <w:p>
+      <w:pPr>
+        <w:pStyle w:val="Heading3"/>
+      </w:pPr>
+      <w:r>
+        <w:rPr>
+          <w:b/>
+          <w:color w:val="57534E"/>
+          <w:sz w:val="22"/>
+        </w:rPr>
+        <w:t>Step 0 — Auth shell (build first)</w:t>
+      </w:r>
+    </w:p>
+    <w:p>
+      <w:pPr>
+        <w:pStyle w:val="ListBullet"/>
+      </w:pPr>
+      <w:r>
+        <w:rPr>
+          <w:b w:val="0"/>
+          <w:sz w:val="21"/>
+        </w:rPr>
+        <w:t xml:space="preserve">On load: read stored token → </w:t>
+      </w:r>
+      <w:r>
+        <w:rPr>
+          <w:rFonts w:ascii="Consolas" w:hAnsi="Consolas"/>
+          <w:color w:val="BE123C"/>
+          <w:sz w:val="21"/>
+        </w:rPr>
+        <w:t>GET /auth/me</w:t>
+      </w:r>
+      <w:r>
+        <w:rPr>
+          <w:b w:val="0"/>
+          <w:sz w:val="21"/>
+        </w:rPr>
+        <w:t xml:space="preserve">. On </w:t>
+      </w:r>
+      <w:r>
+        <w:rPr>
+          <w:rFonts w:ascii="Consolas" w:hAnsi="Consolas"/>
+          <w:color w:val="BE123C"/>
+          <w:sz w:val="21"/>
+        </w:rPr>
+        <w:t>401</w:t>
+      </w:r>
+      <w:r>
+        <w:rPr>
+          <w:b w:val="0"/>
+          <w:sz w:val="21"/>
+        </w:rPr>
+        <w:t>, show login.</w:t>
+      </w:r>
+    </w:p>
+    <w:p>
+      <w:pPr>
+        <w:pStyle w:val="ListBullet"/>
+      </w:pPr>
+      <w:r>
+        <w:rPr>
+          <w:b w:val="0"/>
+          <w:sz w:val="21"/>
+        </w:rPr>
+        <w:t xml:space="preserve">Login form → </w:t>
+      </w:r>
+      <w:r>
+        <w:rPr>
+          <w:rFonts w:ascii="Consolas" w:hAnsi="Consolas"/>
+          <w:color w:val="BE123C"/>
+          <w:sz w:val="21"/>
+        </w:rPr>
+        <w:t>POST /auth/token</w:t>
+      </w:r>
+      <w:r>
+        <w:rPr>
+          <w:b w:val="0"/>
+          <w:sz w:val="21"/>
+        </w:rPr>
+        <w:t xml:space="preserve"> (form-encoded) → store </w:t>
+      </w:r>
+      <w:r>
+        <w:rPr>
+          <w:rFonts w:ascii="Consolas" w:hAnsi="Consolas"/>
+          <w:color w:val="BE123C"/>
+          <w:sz w:val="21"/>
+        </w:rPr>
+        <w:t>access_token</w:t>
+      </w:r>
+      <w:r>
+        <w:rPr>
+          <w:b w:val="0"/>
+          <w:sz w:val="21"/>
+        </w:rPr>
+        <w:t>.</w:t>
+      </w:r>
+    </w:p>
+    <w:p>
+      <w:pPr>
+        <w:pStyle w:val="ListBullet"/>
+      </w:pPr>
+      <w:r>
+        <w:rPr>
+          <w:b w:val="0"/>
+          <w:sz w:val="21"/>
+        </w:rPr>
+        <w:t xml:space="preserve">Attach </w:t>
+      </w:r>
+      <w:r>
+        <w:rPr>
+          <w:rFonts w:ascii="Consolas" w:hAnsi="Consolas"/>
+          <w:color w:val="BE123C"/>
+          <w:sz w:val="21"/>
+        </w:rPr>
+        <w:t>Authorization: Bearer &lt;token&gt;</w:t>
+      </w:r>
+      <w:r>
+        <w:rPr>
+          <w:b w:val="0"/>
+          <w:sz w:val="21"/>
+        </w:rPr>
+        <w:t xml:space="preserve"> to every request; on any </w:t>
+      </w:r>
+      <w:r>
+        <w:rPr>
+          <w:rFonts w:ascii="Consolas" w:hAnsi="Consolas"/>
+          <w:color w:val="BE123C"/>
+          <w:sz w:val="21"/>
+        </w:rPr>
+        <w:t>401</w:t>
+      </w:r>
+      <w:r>
+        <w:rPr>
+          <w:b w:val="0"/>
+          <w:sz w:val="21"/>
+        </w:rPr>
+        <w:t>, clear and return to login.</w:t>
+      </w:r>
+    </w:p>
+    <w:p>
+      <w:pPr>
+        <w:pStyle w:val="Heading3"/>
+      </w:pPr>
+      <w:r>
+        <w:rPr>
+          <w:b/>
+          <w:color w:val="57534E"/>
+          <w:sz w:val="22"/>
+        </w:rPr>
+        <w:t>Step 1 — Fleet overview (landing page)</w:t>
+      </w:r>
+    </w:p>
+    <w:p>
+      <w:pPr>
+        <w:pStyle w:val="ListBullet"/>
+      </w:pPr>
+      <w:r>
+        <w:rPr>
+          <w:rFonts w:ascii="Consolas" w:hAnsi="Consolas"/>
+          <w:color w:val="BE123C"/>
+          <w:sz w:val="21"/>
+        </w:rPr>
+        <w:t>GET /assets</w:t>
+      </w:r>
+      <w:r>
+        <w:rPr>
+          <w:b w:val="0"/>
+          <w:sz w:val="21"/>
+        </w:rPr>
+        <w:t xml:space="preserve"> → one card per machine.</w:t>
+      </w:r>
+    </w:p>
+    <w:p>
+      <w:pPr>
+        <w:pStyle w:val="ListBullet"/>
+      </w:pPr>
+      <w:r>
+        <w:rPr>
+          <w:b w:val="0"/>
+          <w:sz w:val="21"/>
+        </w:rPr>
+        <w:t xml:space="preserve">For a health/severity roll-up per card, either call </w:t>
+      </w:r>
+      <w:r>
+        <w:rPr>
+          <w:rFonts w:ascii="Consolas" w:hAnsi="Consolas"/>
+          <w:color w:val="BE123C"/>
+          <w:sz w:val="21"/>
+        </w:rPr>
+        <w:t>GET /assets/{unit}/findings</w:t>
+      </w:r>
+      <w:r>
+        <w:rPr>
+          <w:b w:val="0"/>
+          <w:sz w:val="21"/>
+        </w:rPr>
+        <w:t xml:space="preserve"> per machine, or show counts lazily.</w:t>
+      </w:r>
+    </w:p>
+    <w:p>
+      <w:pPr>
+        <w:pStyle w:val="ListBullet"/>
+      </w:pPr>
+      <w:r>
+        <w:rPr>
+          <w:b w:val="0"/>
+          <w:sz w:val="21"/>
+        </w:rPr>
+        <w:t>Poll every 30 s.</w:t>
+      </w:r>
+    </w:p>
+    <w:p>
+      <w:pPr>
+        <w:pStyle w:val="Heading3"/>
+      </w:pPr>
+      <w:r>
+        <w:rPr>
+          <w:b/>
+          <w:color w:val="57534E"/>
+          <w:sz w:val="22"/>
+        </w:rPr>
+        <w:t>Step 2 — Machine detail (the core screen)</w:t>
+      </w:r>
+    </w:p>
+    <w:p>
+      <w:r>
+        <w:rPr>
+          <w:b w:val="0"/>
+          <w:sz w:val="21"/>
+        </w:rPr>
+        <w:t>One machine, tabbed. Fetch per tab:</w:t>
+      </w:r>
+    </w:p>
+    <w:tbl>
+      <w:tblPr>
+        <w:tblStyle w:val="TableGrid"/>
+        <w:tblW w:type="auto" w:w="0"/>
+        <w:jc w:val="center"/>
+        <w:tblLook w:firstColumn="1" w:firstRow="1" w:lastColumn="0" w:lastRow="0" w:noHBand="0" w:noVBand="1" w:val="04A0"/>
+      </w:tblPr>
+      <w:tblGrid>
+        <w:gridCol w:w="4320"/>
+        <w:gridCol w:w="4320"/>
+      </w:tblGrid>
+      <w:tr>
+        <w:tc>
+          <w:tcPr>
+            <w:tcW w:type="dxa" w:w="4824"/>
+            <w:shd w:fill="EDE9FE"/>
+          </w:tcPr>
+          <w:p>
+            <w:r>
+              <w:rPr>
+                <w:b/>
+              </w:rPr>
+            </w:r>
+            <w:r>
+              <w:rPr>
+                <w:b/>
+                <w:sz w:val="18"/>
+              </w:rPr>
+              <w:t>Tab</w:t>
+            </w:r>
+          </w:p>
+        </w:tc>
+        <w:tc>
+          <w:tcPr>
+            <w:tcW w:type="dxa" w:w="4824"/>
+            <w:shd w:fill="EDE9FE"/>
+          </w:tcPr>
+          <w:p>
+            <w:r>
+              <w:rPr>
+                <w:b/>
+              </w:rPr>
+            </w:r>
+            <w:r>
+              <w:rPr>
+                <w:b/>
+                <w:sz w:val="18"/>
+              </w:rPr>
+              <w:t>Endpoint</w:t>
+            </w:r>
+          </w:p>
+        </w:tc>
+      </w:tr>
+      <w:tr>
+        <w:tc>
+          <w:tcPr>
+            <w:tcW w:type="dxa" w:w="4824"/>
+          </w:tcPr>
+          <w:p>
+            <w:r/>
+            <w:r>
+              <w:rPr>
+                <w:b/>
+                <w:sz w:val="18"/>
+              </w:rPr>
+              <w:t>Overview / Issues</w:t>
+            </w:r>
+          </w:p>
+        </w:tc>
+        <w:tc>
+          <w:tcPr>
+            <w:tcW w:type="dxa" w:w="4824"/>
+          </w:tcPr>
+          <w:p>
+            <w:r/>
+            <w:r>
+              <w:rPr>
+                <w:rFonts w:ascii="Consolas" w:hAnsi="Consolas"/>
+                <w:color w:val="BE123C"/>
+                <w:sz w:val="18"/>
+              </w:rPr>
+              <w:t>GET /assets/{unit}</w:t>
+            </w:r>
+            <w:r>
+              <w:rPr>
+                <w:b w:val="0"/>
+                <w:sz w:val="18"/>
+              </w:rPr>
+              <w:t xml:space="preserve"> + </w:t>
+            </w:r>
+            <w:r>
+              <w:rPr>
+                <w:rFonts w:ascii="Consolas" w:hAnsi="Consolas"/>
+                <w:color w:val="BE123C"/>
+                <w:sz w:val="18"/>
+              </w:rPr>
+              <w:t>GET /assets/{unit}/findings</w:t>
+            </w:r>
+          </w:p>
+        </w:tc>
+      </w:tr>
+      <w:tr>
+        <w:tc>
+          <w:tcPr>
+            <w:tcW w:type="dxa" w:w="4824"/>
+          </w:tcPr>
+          <w:p>
+            <w:r/>
+            <w:r>
+              <w:rPr>
+                <w:b/>
+                <w:sz w:val="18"/>
+              </w:rPr>
+              <w:t>Outlook</w:t>
+            </w:r>
+          </w:p>
+        </w:tc>
+        <w:tc>
+          <w:tcPr>
+            <w:tcW w:type="dxa" w:w="4824"/>
+          </w:tcPr>
+          <w:p>
+            <w:r/>
+            <w:r>
+              <w:rPr>
+                <w:rFonts w:ascii="Consolas" w:hAnsi="Consolas"/>
+                <w:color w:val="BE123C"/>
+                <w:sz w:val="18"/>
+              </w:rPr>
+              <w:t>GET /assets/{unit}/outlook</w:t>
+            </w:r>
+          </w:p>
+        </w:tc>
+      </w:tr>
+      <w:tr>
+        <w:tc>
+          <w:tcPr>
+            <w:tcW w:type="dxa" w:w="4824"/>
+          </w:tcPr>
+          <w:p>
+            <w:r/>
+            <w:r>
+              <w:rPr>
+                <w:b/>
+                <w:sz w:val="18"/>
+              </w:rPr>
+              <w:t>Sensors</w:t>
+            </w:r>
+          </w:p>
+        </w:tc>
+        <w:tc>
+          <w:tcPr>
+            <w:tcW w:type="dxa" w:w="4824"/>
+          </w:tcPr>
+          <w:p>
+            <w:r/>
+            <w:r>
+              <w:rPr>
+                <w:rFonts w:ascii="Consolas" w:hAnsi="Consolas"/>
+                <w:color w:val="BE123C"/>
+                <w:sz w:val="18"/>
+              </w:rPr>
+              <w:t>GET /assets/{unit}/telemetry?hours=6&amp;points=90</w:t>
+            </w:r>
+          </w:p>
+        </w:tc>
+      </w:tr>
+      <w:tr>
+        <w:tc>
+          <w:tcPr>
+            <w:tcW w:type="dxa" w:w="4824"/>
+          </w:tcPr>
+          <w:p>
+            <w:r/>
+            <w:r>
+              <w:rPr>
+                <w:b/>
+                <w:sz w:val="18"/>
+              </w:rPr>
+              <w:t>Diagnoses</w:t>
+            </w:r>
+          </w:p>
+        </w:tc>
+        <w:tc>
+          <w:tcPr>
+            <w:tcW w:type="dxa" w:w="4824"/>
+          </w:tcPr>
+          <w:p>
+            <w:r/>
+            <w:r>
+              <w:rPr>
+                <w:rFonts w:ascii="Consolas" w:hAnsi="Consolas"/>
+                <w:color w:val="BE123C"/>
+                <w:sz w:val="18"/>
+              </w:rPr>
+              <w:t>GET /assets/{unit}/diagnoses</w:t>
+            </w:r>
+          </w:p>
+        </w:tc>
+      </w:tr>
+      <w:tr>
+        <w:tc>
+          <w:tcPr>
+            <w:tcW w:type="dxa" w:w="4824"/>
+          </w:tcPr>
+          <w:p>
+            <w:r/>
+            <w:r>
+              <w:rPr>
+                <w:b/>
+                <w:sz w:val="18"/>
+              </w:rPr>
+              <w:t>Alerts</w:t>
+            </w:r>
+          </w:p>
+        </w:tc>
+        <w:tc>
+          <w:tcPr>
+            <w:tcW w:type="dxa" w:w="4824"/>
+          </w:tcPr>
+          <w:p>
+            <w:r/>
+            <w:r>
+              <w:rPr>
+                <w:rFonts w:ascii="Consolas" w:hAnsi="Consolas"/>
+                <w:color w:val="BE123C"/>
+                <w:sz w:val="18"/>
+              </w:rPr>
+              <w:t>GET /assets/{unit}/alerts</w:t>
+            </w:r>
+          </w:p>
+        </w:tc>
+      </w:tr>
+      <w:tr>
+        <w:tc>
+          <w:tcPr>
+            <w:tcW w:type="dxa" w:w="4824"/>
+          </w:tcPr>
+          <w:p>
+            <w:r/>
+            <w:r>
+              <w:rPr>
+                <w:b/>
+                <w:sz w:val="18"/>
+              </w:rPr>
+              <w:t>Connections</w:t>
+            </w:r>
+            <w:r>
+              <w:rPr>
+                <w:b w:val="0"/>
+                <w:sz w:val="18"/>
+              </w:rPr>
+              <w:t xml:space="preserve"> (graph)</w:t>
+            </w:r>
+          </w:p>
+        </w:tc>
+        <w:tc>
+          <w:tcPr>
+            <w:tcW w:type="dxa" w:w="4824"/>
+          </w:tcPr>
+          <w:p>
+            <w:r/>
+            <w:r>
+              <w:rPr>
+                <w:rFonts w:ascii="Consolas" w:hAnsi="Consolas"/>
+                <w:color w:val="BE123C"/>
+                <w:sz w:val="18"/>
+              </w:rPr>
+              <w:t>GET /assets/{unit}/graph</w:t>
+            </w:r>
+            <w:r>
+              <w:rPr>
+                <w:b w:val="0"/>
+                <w:sz w:val="18"/>
+              </w:rPr>
+              <w:t xml:space="preserve"> *(on open only — large)*</w:t>
+            </w:r>
+          </w:p>
+        </w:tc>
+      </w:tr>
+      <w:tr>
+        <w:tc>
+          <w:tcPr>
+            <w:tcW w:type="dxa" w:w="4824"/>
+          </w:tcPr>
+          <w:p>
+            <w:r/>
+            <w:r>
+              <w:rPr>
+                <w:b/>
+                <w:sz w:val="18"/>
+              </w:rPr>
+              <w:t>Reports</w:t>
+            </w:r>
+          </w:p>
+        </w:tc>
+        <w:tc>
+          <w:tcPr>
+            <w:tcW w:type="dxa" w:w="4824"/>
+          </w:tcPr>
+          <w:p>
+            <w:r/>
+            <w:r>
+              <w:rPr>
+                <w:rFonts w:ascii="Consolas" w:hAnsi="Consolas"/>
+                <w:color w:val="BE123C"/>
+                <w:sz w:val="18"/>
+              </w:rPr>
+              <w:t>GET /assets/{unit}/reports</w:t>
+            </w:r>
+            <w:r>
+              <w:rPr>
+                <w:b w:val="0"/>
+                <w:sz w:val="18"/>
+              </w:rPr>
+              <w:t xml:space="preserve"> *(on open only)*</w:t>
+            </w:r>
+          </w:p>
+        </w:tc>
+      </w:tr>
+      <w:tr>
+        <w:tc>
+          <w:tcPr>
+            <w:tcW w:type="dxa" w:w="4824"/>
+          </w:tcPr>
+          <w:p>
+            <w:r/>
+            <w:r>
+              <w:rPr>
+                <w:b/>
+                <w:sz w:val="18"/>
+              </w:rPr>
+              <w:t>Check history</w:t>
+            </w:r>
+          </w:p>
+        </w:tc>
+        <w:tc>
+          <w:tcPr>
+            <w:tcW w:type="dxa" w:w="4824"/>
+          </w:tcPr>
+          <w:p>
+            <w:r/>
+            <w:r>
+              <w:rPr>
+                <w:rFonts w:ascii="Consolas" w:hAnsi="Consolas"/>
+                <w:color w:val="BE123C"/>
+                <w:sz w:val="18"/>
+              </w:rPr>
+              <w:t>GET /runs/{unit}</w:t>
+            </w:r>
+            <w:r>
+              <w:rPr>
+                <w:b w:val="0"/>
+                <w:sz w:val="18"/>
+              </w:rPr>
+              <w:t xml:space="preserve"> *(on open only)*</w:t>
+            </w:r>
+          </w:p>
+        </w:tc>
+      </w:tr>
+    </w:tbl>
+    <w:p/>
+    <w:p>
+      <w:r>
+        <w:rPr>
+          <w:b w:val="0"/>
+          <w:sz w:val="21"/>
+        </w:rPr>
+        <w:t>Rendering rules that matter:</w:t>
+      </w:r>
+    </w:p>
+    <w:p>
+      <w:pPr>
+        <w:pStyle w:val="ListBullet"/>
+      </w:pPr>
+      <w:r>
+        <w:rPr>
+          <w:b w:val="0"/>
+          <w:sz w:val="21"/>
+        </w:rPr>
+        <w:t xml:space="preserve">Colour by </w:t>
+      </w:r>
+      <w:r>
+        <w:rPr>
+          <w:rFonts w:ascii="Consolas" w:hAnsi="Consolas"/>
+          <w:color w:val="BE123C"/>
+          <w:sz w:val="21"/>
+        </w:rPr>
+        <w:t>severity</w:t>
+      </w:r>
+      <w:r>
+        <w:rPr>
+          <w:b w:val="0"/>
+          <w:sz w:val="21"/>
+        </w:rPr>
+        <w:t xml:space="preserve">. Show </w:t>
+      </w:r>
+      <w:r>
+        <w:rPr>
+          <w:rFonts w:ascii="Consolas" w:hAnsi="Consolas"/>
+          <w:color w:val="BE123C"/>
+          <w:sz w:val="21"/>
+        </w:rPr>
+        <w:t>evidence[]</w:t>
+      </w:r>
+      <w:r>
+        <w:rPr>
+          <w:b w:val="0"/>
+          <w:sz w:val="21"/>
+        </w:rPr>
+        <w:t xml:space="preserve"> under every finding.</w:t>
+      </w:r>
+    </w:p>
+    <w:p>
+      <w:pPr>
+        <w:pStyle w:val="ListBullet"/>
+      </w:pPr>
+      <w:r>
+        <w:rPr>
+          <w:b w:val="0"/>
+          <w:sz w:val="21"/>
+        </w:rPr>
+        <w:t xml:space="preserve">Tag findings by </w:t>
+      </w:r>
+      <w:r>
+        <w:rPr>
+          <w:rFonts w:ascii="Consolas" w:hAnsi="Consolas"/>
+          <w:color w:val="BE123C"/>
+          <w:sz w:val="21"/>
+        </w:rPr>
+        <w:t>origin</w:t>
+      </w:r>
+      <w:r>
+        <w:rPr>
+          <w:b w:val="0"/>
+          <w:sz w:val="21"/>
+        </w:rPr>
+        <w:t xml:space="preserve"> — style </w:t>
+      </w:r>
+      <w:r>
+        <w:rPr>
+          <w:rFonts w:ascii="Consolas" w:hAnsi="Consolas"/>
+          <w:color w:val="BE123C"/>
+          <w:sz w:val="21"/>
+        </w:rPr>
+        <w:t>learned</w:t>
+      </w:r>
+      <w:r>
+        <w:rPr>
+          <w:b w:val="0"/>
+          <w:sz w:val="21"/>
+        </w:rPr>
+        <w:t xml:space="preserve"> as an advisory "early signal", never a fact.</w:t>
+      </w:r>
+    </w:p>
+    <w:p>
+      <w:pPr>
+        <w:pStyle w:val="ListBullet"/>
+      </w:pPr>
+      <w:r>
+        <w:rPr>
+          <w:b w:val="0"/>
+          <w:sz w:val="21"/>
+        </w:rPr>
+        <w:t xml:space="preserve">On </w:t>
+      </w:r>
+      <w:r>
+        <w:rPr>
+          <w:rFonts w:ascii="Consolas" w:hAnsi="Consolas"/>
+          <w:color w:val="BE123C"/>
+          <w:sz w:val="21"/>
+        </w:rPr>
+        <w:t>learned</w:t>
+      </w:r>
+      <w:r>
+        <w:rPr>
+          <w:b w:val="0"/>
+          <w:sz w:val="21"/>
+        </w:rPr>
+        <w:t xml:space="preserve"> findings, show the </w:t>
+      </w:r>
+      <w:r>
+        <w:rPr>
+          <w:b/>
+          <w:sz w:val="21"/>
+        </w:rPr>
+        <w:t>feedback buttons</w:t>
+      </w:r>
+      <w:r>
+        <w:rPr>
+          <w:b w:val="0"/>
+          <w:sz w:val="21"/>
+        </w:rPr>
+        <w:t xml:space="preserve"> (§8) and hide them on </w:t>
+      </w:r>
+      <w:r>
+        <w:rPr>
+          <w:rFonts w:ascii="Consolas" w:hAnsi="Consolas"/>
+          <w:color w:val="BE123C"/>
+          <w:sz w:val="21"/>
+        </w:rPr>
+        <w:t>derived</w:t>
+      </w:r>
+      <w:r>
+        <w:rPr>
+          <w:b w:val="0"/>
+          <w:sz w:val="21"/>
+        </w:rPr>
+        <w:t>/</w:t>
+      </w:r>
+      <w:r>
+        <w:rPr>
+          <w:rFonts w:ascii="Consolas" w:hAnsi="Consolas"/>
+          <w:color w:val="BE123C"/>
+          <w:sz w:val="21"/>
+        </w:rPr>
+        <w:t>diagnosed</w:t>
+      </w:r>
+      <w:r>
+        <w:rPr>
+          <w:b w:val="0"/>
+          <w:sz w:val="21"/>
+        </w:rPr>
+        <w:t>.</w:t>
+      </w:r>
+    </w:p>
+    <w:p>
+      <w:pPr>
+        <w:pStyle w:val="Heading3"/>
+      </w:pPr>
+      <w:r>
+        <w:rPr>
+          <w:b/>
+          <w:color w:val="57534E"/>
+          <w:sz w:val="22"/>
+        </w:rPr>
+        <w:t>Step 3 — Alerts page (all machines)</w:t>
+      </w:r>
+    </w:p>
+    <w:p>
+      <w:pPr>
+        <w:pStyle w:val="ListBullet"/>
+      </w:pPr>
+      <w:r>
+        <w:rPr>
+          <w:rFonts w:ascii="Consolas" w:hAnsi="Consolas"/>
+          <w:color w:val="BE123C"/>
+          <w:sz w:val="21"/>
+        </w:rPr>
+        <w:t>GET /alerts?limit=200</w:t>
+      </w:r>
+      <w:r>
+        <w:rPr>
+          <w:b w:val="0"/>
+          <w:sz w:val="21"/>
+        </w:rPr>
+        <w:t>, poll 30 s.</w:t>
+      </w:r>
+    </w:p>
+    <w:p>
+      <w:pPr>
+        <w:pStyle w:val="ListBullet"/>
+      </w:pPr>
+      <w:r>
+        <w:rPr>
+          <w:b w:val="0"/>
+          <w:sz w:val="21"/>
+        </w:rPr>
+        <w:t xml:space="preserve">Group/label by </w:t>
+      </w:r>
+      <w:r>
+        <w:rPr>
+          <w:rFonts w:ascii="Consolas" w:hAnsi="Consolas"/>
+          <w:color w:val="BE123C"/>
+          <w:sz w:val="21"/>
+        </w:rPr>
+        <w:t>kind</w:t>
+      </w:r>
+      <w:r>
+        <w:rPr>
+          <w:b w:val="0"/>
+          <w:sz w:val="21"/>
+        </w:rPr>
+        <w:t xml:space="preserve"> (triggered / reminder / resolved) and </w:t>
+      </w:r>
+      <w:r>
+        <w:rPr>
+          <w:rFonts w:ascii="Consolas" w:hAnsi="Consolas"/>
+          <w:color w:val="BE123C"/>
+          <w:sz w:val="21"/>
+        </w:rPr>
+        <w:t>status</w:t>
+      </w:r>
+      <w:r>
+        <w:rPr>
+          <w:b w:val="0"/>
+          <w:sz w:val="21"/>
+        </w:rPr>
+        <w:t xml:space="preserve"> (sent / pending / failed / suppressed / skipped) — see §6 for the UI mapping.</w:t>
+      </w:r>
+    </w:p>
+    <w:p>
+      <w:pPr>
+        <w:pStyle w:val="ListBullet"/>
+      </w:pPr>
+      <w:r>
+        <w:rPr>
+          <w:b w:val="0"/>
+          <w:sz w:val="21"/>
+        </w:rPr>
+        <w:t xml:space="preserve">Render from </w:t>
+      </w:r>
+      <w:r>
+        <w:rPr>
+          <w:rFonts w:ascii="Consolas" w:hAnsi="Consolas"/>
+          <w:color w:val="BE123C"/>
+          <w:sz w:val="21"/>
+        </w:rPr>
+        <w:t>payload</w:t>
+      </w:r>
+      <w:r>
+        <w:rPr>
+          <w:b w:val="0"/>
+          <w:sz w:val="21"/>
+        </w:rPr>
+        <w:t xml:space="preserve"> (it is frozen at decision time); don't re-fetch the finding.</w:t>
+      </w:r>
+    </w:p>
+    <w:p>
+      <w:pPr>
+        <w:pStyle w:val="ListBullet"/>
+      </w:pPr>
+      <w:r>
+        <w:rPr>
+          <w:b w:val="0"/>
+          <w:sz w:val="21"/>
+        </w:rPr>
+        <w:t xml:space="preserve">Admin only: a "send test email" button → </w:t>
+      </w:r>
+      <w:r>
+        <w:rPr>
+          <w:rFonts w:ascii="Consolas" w:hAnsi="Consolas"/>
+          <w:color w:val="BE123C"/>
+          <w:sz w:val="21"/>
+        </w:rPr>
+        <w:t>POST /alerts/test</w:t>
+      </w:r>
+      <w:r>
+        <w:rPr>
+          <w:b w:val="0"/>
+          <w:sz w:val="21"/>
+        </w:rPr>
+        <w:t>.</w:t>
+      </w:r>
+    </w:p>
+    <w:p>
+      <w:pPr>
+        <w:pStyle w:val="Heading3"/>
+      </w:pPr>
+      <w:r>
+        <w:rPr>
+          <w:b/>
+          <w:color w:val="57534E"/>
+          <w:sz w:val="22"/>
+        </w:rPr>
+        <w:t>Step 4 — Copilot</w:t>
+      </w:r>
+    </w:p>
+    <w:p>
+      <w:pPr>
+        <w:pStyle w:val="ListBullet"/>
+      </w:pPr>
+      <w:r>
+        <w:rPr>
+          <w:rFonts w:ascii="Consolas" w:hAnsi="Consolas"/>
+          <w:color w:val="BE123C"/>
+          <w:sz w:val="21"/>
+        </w:rPr>
+        <w:t>POST /llm/query</w:t>
+      </w:r>
+      <w:r>
+        <w:rPr>
+          <w:b w:val="0"/>
+          <w:sz w:val="21"/>
+        </w:rPr>
+        <w:t xml:space="preserve"> with </w:t>
+      </w:r>
+      <w:r>
+        <w:rPr>
+          <w:rFonts w:ascii="Consolas" w:hAnsi="Consolas"/>
+          <w:color w:val="BE123C"/>
+          <w:sz w:val="21"/>
+        </w:rPr>
+        <w:t>{ unit, question, persona, history }</w:t>
+      </w:r>
+      <w:r>
+        <w:rPr>
+          <w:b w:val="0"/>
+          <w:sz w:val="21"/>
+        </w:rPr>
+        <w:t>.</w:t>
+      </w:r>
+    </w:p>
+    <w:p>
+      <w:pPr>
+        <w:pStyle w:val="ListBullet"/>
+      </w:pPr>
+      <w:r>
+        <w:rPr>
+          <w:b w:val="0"/>
+          <w:sz w:val="21"/>
+        </w:rPr>
+        <w:t xml:space="preserve">Render </w:t>
+      </w:r>
+      <w:r>
+        <w:rPr>
+          <w:rFonts w:ascii="Consolas" w:hAnsi="Consolas"/>
+          <w:color w:val="BE123C"/>
+          <w:sz w:val="21"/>
+        </w:rPr>
+        <w:t>claims[]</w:t>
+      </w:r>
+      <w:r>
+        <w:rPr>
+          <w:b w:val="0"/>
+          <w:sz w:val="21"/>
+        </w:rPr>
+        <w:t xml:space="preserve"> with clickable </w:t>
+      </w:r>
+      <w:r>
+        <w:rPr>
+          <w:rFonts w:ascii="Consolas" w:hAnsi="Consolas"/>
+          <w:color w:val="BE123C"/>
+          <w:sz w:val="21"/>
+        </w:rPr>
+        <w:t>citations</w:t>
+      </w:r>
+      <w:r>
+        <w:rPr>
+          <w:b w:val="0"/>
+          <w:sz w:val="21"/>
+        </w:rPr>
+        <w:t xml:space="preserve"> (each is a </w:t>
+      </w:r>
+      <w:r>
+        <w:rPr>
+          <w:rFonts w:ascii="Consolas" w:hAnsi="Consolas"/>
+          <w:color w:val="BE123C"/>
+          <w:sz w:val="21"/>
+        </w:rPr>
+        <w:t>finding_id</w:t>
+      </w:r>
+      <w:r>
+        <w:rPr>
+          <w:b w:val="0"/>
+          <w:sz w:val="21"/>
+        </w:rPr>
+        <w:t>).</w:t>
+      </w:r>
+    </w:p>
+    <w:p>
+      <w:pPr>
+        <w:pStyle w:val="ListBullet"/>
+      </w:pPr>
+      <w:r>
+        <w:rPr>
+          <w:b w:val="0"/>
+          <w:sz w:val="21"/>
+        </w:rPr>
+        <w:t xml:space="preserve">Show </w:t>
+      </w:r>
+      <w:r>
+        <w:rPr>
+          <w:rFonts w:ascii="Consolas" w:hAnsi="Consolas"/>
+          <w:color w:val="BE123C"/>
+          <w:sz w:val="21"/>
+        </w:rPr>
+        <w:t>insufficient[]</w:t>
+      </w:r>
+      <w:r>
+        <w:rPr>
+          <w:b w:val="0"/>
+          <w:sz w:val="21"/>
+        </w:rPr>
+        <w:t xml:space="preserve">. If </w:t>
+      </w:r>
+      <w:r>
+        <w:rPr>
+          <w:rFonts w:ascii="Consolas" w:hAnsi="Consolas"/>
+          <w:color w:val="BE123C"/>
+          <w:sz w:val="21"/>
+        </w:rPr>
+        <w:t>model</w:t>
+      </w:r>
+      <w:r>
+        <w:rPr>
+          <w:b w:val="0"/>
+          <w:sz w:val="21"/>
+        </w:rPr>
+        <w:t xml:space="preserve"> is </w:t>
+      </w:r>
+      <w:r>
+        <w:rPr>
+          <w:rFonts w:ascii="Consolas" w:hAnsi="Consolas"/>
+          <w:color w:val="BE123C"/>
+          <w:sz w:val="21"/>
+        </w:rPr>
+        <w:t>deterministic_stub</w:t>
+      </w:r>
+      <w:r>
+        <w:rPr>
+          <w:b w:val="0"/>
+          <w:sz w:val="21"/>
+        </w:rPr>
+        <w:t>, show an "offline" banner.</w:t>
+      </w:r>
+    </w:p>
+    <w:p>
+      <w:pPr>
+        <w:pStyle w:val="Heading3"/>
+      </w:pPr>
+      <w:r>
+        <w:rPr>
+          <w:b/>
+          <w:color w:val="57534E"/>
+          <w:sz w:val="22"/>
+        </w:rPr>
+        <w:t>Step 5 — Feedback / learning progress</w:t>
+      </w:r>
+    </w:p>
+    <w:p>
+      <w:pPr>
+        <w:pStyle w:val="ListBullet"/>
+      </w:pPr>
+      <w:r>
+        <w:rPr>
+          <w:b w:val="0"/>
+          <w:sz w:val="21"/>
+        </w:rPr>
+        <w:t xml:space="preserve">Feedback buttons on learned findings → </w:t>
+      </w:r>
+      <w:r>
+        <w:rPr>
+          <w:rFonts w:ascii="Consolas" w:hAnsi="Consolas"/>
+          <w:color w:val="BE123C"/>
+          <w:sz w:val="21"/>
+        </w:rPr>
+        <w:t>POST /findings/{identity_key}/feedback</w:t>
+      </w:r>
+      <w:r>
+        <w:rPr>
+          <w:b w:val="0"/>
+          <w:sz w:val="21"/>
+        </w:rPr>
+        <w:t>.</w:t>
+      </w:r>
+    </w:p>
+    <w:p>
+      <w:pPr>
+        <w:pStyle w:val="ListBullet"/>
+      </w:pPr>
+      <w:r>
+        <w:rPr>
+          <w:b w:val="0"/>
+          <w:sz w:val="21"/>
+        </w:rPr>
+        <w:t xml:space="preserve">Current verdict per finding → last item of </w:t>
+      </w:r>
+      <w:r>
+        <w:rPr>
+          <w:rFonts w:ascii="Consolas" w:hAnsi="Consolas"/>
+          <w:color w:val="BE123C"/>
+          <w:sz w:val="21"/>
+        </w:rPr>
+        <w:t>GET /findings/{identity_key}/feedback</w:t>
+      </w:r>
+      <w:r>
+        <w:rPr>
+          <w:b w:val="0"/>
+          <w:sz w:val="21"/>
+        </w:rPr>
+        <w:t>.</w:t>
+      </w:r>
+    </w:p>
+    <w:p>
+      <w:pPr>
+        <w:pStyle w:val="ListBullet"/>
+      </w:pPr>
+      <w:r>
+        <w:rPr>
+          <w:b w:val="0"/>
+          <w:sz w:val="21"/>
+        </w:rPr>
+        <w:t xml:space="preserve">Optional "label progress" widget → </w:t>
+      </w:r>
+      <w:r>
+        <w:rPr>
+          <w:rFonts w:ascii="Consolas" w:hAnsi="Consolas"/>
+          <w:color w:val="BE123C"/>
+          <w:sz w:val="21"/>
+        </w:rPr>
+        <w:t>GET /feedback/stats</w:t>
+      </w:r>
+      <w:r>
+        <w:rPr>
+          <w:b w:val="0"/>
+          <w:sz w:val="21"/>
+        </w:rPr>
+        <w:t>.</w:t>
+      </w:r>
+    </w:p>
+    <w:p>
+      <w:pPr>
+        <w:pStyle w:val="Heading3"/>
+      </w:pPr>
+      <w:r>
+        <w:rPr>
+          <w:b/>
+          <w:color w:val="57534E"/>
+          <w:sz w:val="22"/>
+        </w:rPr>
+        <w:t>Step 6 — Ops / health (optional)</w:t>
+      </w:r>
+    </w:p>
+    <w:p>
+      <w:pPr>
+        <w:pStyle w:val="ListBullet"/>
+      </w:pPr>
+      <w:r>
+        <w:rPr>
+          <w:rFonts w:ascii="Consolas" w:hAnsi="Consolas"/>
+          <w:color w:val="BE123C"/>
+          <w:sz w:val="21"/>
+        </w:rPr>
+        <w:t>GET /health</w:t>
+      </w:r>
+      <w:r>
+        <w:rPr>
+          <w:b w:val="0"/>
+          <w:sz w:val="21"/>
+        </w:rPr>
+        <w:t xml:space="preserve">, </w:t>
+      </w:r>
+      <w:r>
+        <w:rPr>
+          <w:rFonts w:ascii="Consolas" w:hAnsi="Consolas"/>
+          <w:color w:val="BE123C"/>
+          <w:sz w:val="21"/>
+        </w:rPr>
+        <w:t>GET /ready</w:t>
+      </w:r>
+      <w:r>
+        <w:rPr>
+          <w:b w:val="0"/>
+          <w:sz w:val="21"/>
+        </w:rPr>
+        <w:t xml:space="preserve">, </w:t>
+      </w:r>
+      <w:r>
+        <w:rPr>
+          <w:rFonts w:ascii="Consolas" w:hAnsi="Consolas"/>
+          <w:color w:val="BE123C"/>
+          <w:sz w:val="21"/>
+        </w:rPr>
+        <w:t>GET /metrics</w:t>
+      </w:r>
+      <w:r>
+        <w:rPr>
+          <w:b w:val="0"/>
+          <w:sz w:val="21"/>
+        </w:rPr>
+        <w:t xml:space="preserve"> (Prometheus text) for a status strip.</w:t>
+      </w:r>
+    </w:p>
+    <w:p>
+      <w:pPr>
+        <w:pStyle w:val="Heading3"/>
+      </w:pPr>
+      <w:r>
+        <w:rPr>
+          <w:b/>
+          <w:color w:val="57534E"/>
+          <w:sz w:val="22"/>
+        </w:rPr>
+        <w:t>Cross-cutting (applies everywhere)</w:t>
+      </w:r>
+    </w:p>
+    <w:p>
+      <w:pPr>
+        <w:pStyle w:val="ListBullet"/>
+      </w:pPr>
+      <w:r>
+        <w:rPr>
+          <w:b/>
+          <w:sz w:val="21"/>
+        </w:rPr>
+        <w:t>Poll</w:t>
+      </w:r>
+      <w:r>
+        <w:rPr>
+          <w:b w:val="0"/>
+          <w:sz w:val="21"/>
+        </w:rPr>
+        <w:t xml:space="preserve"> telemetry/outlook/alerts/findings at 30 s; fetch graph/reports/runs on open.</w:t>
+      </w:r>
+    </w:p>
+    <w:p>
+      <w:pPr>
+        <w:pStyle w:val="ListBullet"/>
+      </w:pPr>
+      <w:r>
+        <w:rPr>
+          <w:b/>
+          <w:sz w:val="21"/>
+        </w:rPr>
+        <w:t>Guard nullables:</w:t>
+      </w:r>
+      <w:r>
+        <w:rPr>
+          <w:b w:val="0"/>
+          <w:sz w:val="21"/>
+        </w:rPr>
+        <w:t xml:space="preserve"> </w:t>
+      </w:r>
+      <w:r>
+        <w:rPr>
+          <w:rFonts w:ascii="Consolas" w:hAnsi="Consolas"/>
+          <w:color w:val="BE123C"/>
+          <w:sz w:val="21"/>
+        </w:rPr>
+        <w:t>threshold</w:t>
+      </w:r>
+      <w:r>
+        <w:rPr>
+          <w:b w:val="0"/>
+          <w:sz w:val="21"/>
+        </w:rPr>
+        <w:t xml:space="preserve">, </w:t>
+      </w:r>
+      <w:r>
+        <w:rPr>
+          <w:rFonts w:ascii="Consolas" w:hAnsi="Consolas"/>
+          <w:color w:val="BE123C"/>
+          <w:sz w:val="21"/>
+        </w:rPr>
+        <w:t>latest</w:t>
+      </w:r>
+      <w:r>
+        <w:rPr>
+          <w:b w:val="0"/>
+          <w:sz w:val="21"/>
+        </w:rPr>
+        <w:t xml:space="preserve">, </w:t>
+      </w:r>
+      <w:r>
+        <w:rPr>
+          <w:rFonts w:ascii="Consolas" w:hAnsi="Consolas"/>
+          <w:color w:val="BE123C"/>
+          <w:sz w:val="21"/>
+        </w:rPr>
+        <w:t>condition_score</w:t>
+      </w:r>
+      <w:r>
+        <w:rPr>
+          <w:b w:val="0"/>
+          <w:sz w:val="21"/>
+        </w:rPr>
+        <w:t xml:space="preserve">, </w:t>
+      </w:r>
+      <w:r>
+        <w:rPr>
+          <w:rFonts w:ascii="Consolas" w:hAnsi="Consolas"/>
+          <w:color w:val="BE123C"/>
+          <w:sz w:val="21"/>
+        </w:rPr>
+        <w:t>soonest</w:t>
+      </w:r>
+      <w:r>
+        <w:rPr>
+          <w:b w:val="0"/>
+          <w:sz w:val="21"/>
+        </w:rPr>
+        <w:t xml:space="preserve">, </w:t>
+      </w:r>
+      <w:r>
+        <w:rPr>
+          <w:rFonts w:ascii="Consolas" w:hAnsi="Consolas"/>
+          <w:color w:val="BE123C"/>
+          <w:sz w:val="21"/>
+        </w:rPr>
+        <w:t>novelty</w:t>
+      </w:r>
+      <w:r>
+        <w:rPr>
+          <w:b w:val="0"/>
+          <w:sz w:val="21"/>
+        </w:rPr>
+        <w:t xml:space="preserve">, </w:t>
+      </w:r>
+      <w:r>
+        <w:rPr>
+          <w:rFonts w:ascii="Consolas" w:hAnsi="Consolas"/>
+          <w:color w:val="BE123C"/>
+          <w:sz w:val="21"/>
+        </w:rPr>
+        <w:t>weakest_subsystem</w:t>
+      </w:r>
+      <w:r>
+        <w:rPr>
+          <w:b w:val="0"/>
+          <w:sz w:val="21"/>
+        </w:rPr>
+        <w:t xml:space="preserve">, </w:t>
+      </w:r>
+      <w:r>
+        <w:rPr>
+          <w:rFonts w:ascii="Consolas" w:hAnsi="Consolas"/>
+          <w:color w:val="BE123C"/>
+          <w:sz w:val="21"/>
+        </w:rPr>
+        <w:t>subsystem_key</w:t>
+      </w:r>
+      <w:r>
+        <w:rPr>
+          <w:b w:val="0"/>
+          <w:sz w:val="21"/>
+        </w:rPr>
+        <w:t xml:space="preserve">, </w:t>
+      </w:r>
+      <w:r>
+        <w:rPr>
+          <w:rFonts w:ascii="Consolas" w:hAnsi="Consolas"/>
+          <w:color w:val="BE123C"/>
+          <w:sz w:val="21"/>
+        </w:rPr>
+        <w:t>last_error</w:t>
+      </w:r>
+      <w:r>
+        <w:rPr>
+          <w:b w:val="0"/>
+          <w:sz w:val="21"/>
+        </w:rPr>
+        <w:t xml:space="preserve">, </w:t>
+      </w:r>
+      <w:r>
+        <w:rPr>
+          <w:rFonts w:ascii="Consolas" w:hAnsi="Consolas"/>
+          <w:color w:val="BE123C"/>
+          <w:sz w:val="21"/>
+        </w:rPr>
+        <w:t>sent_at</w:t>
+      </w:r>
+      <w:r>
+        <w:rPr>
+          <w:b w:val="0"/>
+          <w:sz w:val="21"/>
+        </w:rPr>
+        <w:t>.</w:t>
+      </w:r>
+    </w:p>
+    <w:p>
+      <w:pPr>
+        <w:pStyle w:val="ListBullet"/>
+      </w:pPr>
+      <w:r>
+        <w:rPr>
+          <w:b/>
+          <w:sz w:val="21"/>
+        </w:rPr>
+        <w:t>All timestamps are UTC</w:t>
+      </w:r>
+      <w:r>
+        <w:rPr>
+          <w:b w:val="0"/>
+          <w:sz w:val="21"/>
+        </w:rPr>
+        <w:t xml:space="preserve"> ISO-8601 — convert for display.</w:t>
+      </w:r>
+    </w:p>
+    <w:p>
+      <w:pPr>
+        <w:pStyle w:val="ListBullet"/>
+      </w:pPr>
+      <w:r>
+        <w:rPr>
+          <w:b/>
+          <w:sz w:val="21"/>
+        </w:rPr>
+        <w:t>Two ids:</w:t>
+      </w:r>
+      <w:r>
+        <w:rPr>
+          <w:b w:val="0"/>
+          <w:sz w:val="21"/>
+        </w:rPr>
+        <w:t xml:space="preserve"> </w:t>
+      </w:r>
+      <w:r>
+        <w:rPr>
+          <w:rFonts w:ascii="Consolas" w:hAnsi="Consolas"/>
+          <w:color w:val="BE123C"/>
+          <w:sz w:val="21"/>
+        </w:rPr>
+        <w:t>finding_id</w:t>
+      </w:r>
+      <w:r>
+        <w:rPr>
+          <w:b w:val="0"/>
+          <w:sz w:val="21"/>
+        </w:rPr>
+        <w:t xml:space="preserve"> = this observation (React key); </w:t>
+      </w:r>
+      <w:r>
+        <w:rPr>
+          <w:rFonts w:ascii="Consolas" w:hAnsi="Consolas"/>
+          <w:color w:val="BE123C"/>
+          <w:sz w:val="21"/>
+        </w:rPr>
+        <w:t>identity_key</w:t>
+      </w:r>
+      <w:r>
+        <w:rPr>
+          <w:b w:val="0"/>
+          <w:sz w:val="21"/>
+        </w:rPr>
+        <w:t xml:space="preserve"> = the condition across time (feedback, alerts, correlation).</w:t>
+      </w:r>
+    </w:p>
+    <w:p>
+      <w:pPr>
+        <w:pStyle w:val="Heading3"/>
+      </w:pPr>
+      <w:r>
+        <w:rPr>
+          <w:b/>
+          <w:color w:val="57534E"/>
+          <w:sz w:val="22"/>
+        </w:rPr>
+        <w:t>CORS note for a separately-hosted frontend</w:t>
+      </w:r>
+    </w:p>
+    <w:p>
+      <w:r>
+        <w:rPr>
+          <w:b w:val="0"/>
+          <w:sz w:val="21"/>
+        </w:rPr>
+        <w:t xml:space="preserve">If you serve the UI from a different origin than </w:t>
+      </w:r>
+      <w:r>
+        <w:rPr>
+          <w:rFonts w:ascii="Consolas" w:hAnsi="Consolas"/>
+          <w:color w:val="BE123C"/>
+          <w:sz w:val="21"/>
+        </w:rPr>
+        <w:t>http://35.254.19.129:8000</w:t>
+      </w:r>
+      <w:r>
+        <w:rPr>
+          <w:b w:val="0"/>
+          <w:sz w:val="21"/>
+        </w:rPr>
+        <w:t xml:space="preserve">, the browser needs the API to allow that origin. Tell the backend team your UI's origin; they set </w:t>
+      </w:r>
+      <w:r>
+        <w:rPr>
+          <w:rFonts w:ascii="Consolas" w:hAnsi="Consolas"/>
+          <w:color w:val="BE123C"/>
+          <w:sz w:val="21"/>
+        </w:rPr>
+        <w:t>SENSEMINDS_CORS_ALLOW_ORIGINS</w:t>
+      </w:r>
+      <w:r>
+        <w:rPr>
+          <w:b w:val="0"/>
+          <w:sz w:val="21"/>
+        </w:rPr>
+        <w:t xml:space="preserve"> and restart the API. Same-origin calls (and all server-side/Postman/</w:t>
+      </w:r>
+      <w:r>
+        <w:rPr>
+          <w:rFonts w:ascii="Consolas" w:hAnsi="Consolas"/>
+          <w:color w:val="BE123C"/>
+          <w:sz w:val="21"/>
+        </w:rPr>
+        <w:t>curl</w:t>
+      </w:r>
+      <w:r>
+        <w:rPr>
+          <w:b w:val="0"/>
+          <w:sz w:val="21"/>
+        </w:rPr>
+        <w:t xml:space="preserve"> calls) need nothing.</w:t>
       </w:r>
     </w:p>
     <w:sectPr>

</xml_diff>